<commit_message>
Especificação Funcional da Sprint 06: os seis Feature Sets alcançados
ESCOPO.txt passa ao recorte da SP06 (AVL-ALO, AVL-APU, AVL-PAI, CFG-EMA,
INS-ACO, INS-NOT); os quatro .docx só da SP05 saem da central. Jornadas
re-renderizadas (as três de AVL estavam defasadas desde a regeneração dos
N2) e telas de Acompanhamento capturadas; as demais telas do cache
conferidas idênticas aos protótipos atuais.

Co-Authored-By: Claude Opus 5.5 <noreply@anthropic.com>
Claude-Session: https://claude.ai/code/session_011MczHADsH6JBVA4cLRd5rN
</commit_message>
<xml_diff>
--- a/documentos/AlocacaoDeAvaliadores.docx
+++ b/documentos/AlocacaoDeAvaliadores.docx
@@ -264,6 +264,64 @@
               <w:spacing w:before="0" w:after="0"/>
             </w:pPr>
             <w:r>
+              <w:t xml:space="preserve">1.1</w:t>
+            </w:r>
+          </w:p>
+        </w:tc>
+        <w:tc>
+          <w:tcPr>
+            <w:tcW w:w="1367" w:type="dxa"/>
+            <w:vAlign w:val="center"/>
+          </w:tcPr>
+          <w:p>
+            <w:pPr>
+              <w:spacing w:before="0" w:after="0"/>
+            </w:pPr>
+            <w:r>
+              <w:t xml:space="preserve">2026-10-04</w:t>
+            </w:r>
+          </w:p>
+        </w:tc>
+        <w:tc>
+          <w:tcPr>
+            <w:tcW w:w="5616" w:type="dxa"/>
+            <w:vAlign w:val="center"/>
+          </w:tcPr>
+          <w:p>
+            <w:pPr>
+              <w:spacing w:before="0" w:after="0"/>
+            </w:pPr>
+            <w:r>
+              <w:t xml:space="preserve">Regenerado — Artefato regenerado com o engine 4.1.0: carimbo, subtítulo com Major Feature Set, tabela de Features sem a coluna Prioridade (perfil requisitos), tabela de Telas separada da régua seguinte e rodapé com o nome do N1. Mantida a coluna Caminho de menu, convenção desta instância</w:t>
+            </w:r>
+          </w:p>
+        </w:tc>
+        <w:tc>
+          <w:tcPr>
+            <w:tcW w:w="1568" w:type="dxa"/>
+            <w:vAlign w:val="center"/>
+          </w:tcPr>
+          <w:p>
+            <w:pPr>
+              <w:spacing w:before="0" w:after="0"/>
+            </w:pPr>
+            <w:r>
+              <w:t xml:space="preserve">PHL TI</w:t>
+            </w:r>
+          </w:p>
+        </w:tc>
+      </w:tr>
+      <w:tr>
+        <w:tc>
+          <w:tcPr>
+            <w:tcW w:w="1077" w:type="dxa"/>
+            <w:vAlign w:val="center"/>
+          </w:tcPr>
+          <w:p>
+            <w:pPr>
+              <w:spacing w:before="0" w:after="0"/>
+            </w:pPr>
+            <w:r>
               <w:t xml:space="preserve">1.0</w:t>
             </w:r>
           </w:p>
@@ -1029,7 +1087,7 @@
       <w:r>
         <w:drawing>
           <wp:inline distT="0" distB="0" distL="0" distR="0">
-            <wp:extent cx="2994653" cy="8412480"/>
+            <wp:extent cx="3885672" cy="8412480"/>
             <wp:effectExtent l="0" t="0" r="0" b="0"/>
             <wp:docPr id="300" name="Jornada"/>
             <wp:cNvGraphicFramePr>
@@ -1051,7 +1109,7 @@
                   <pic:spPr>
                     <a:xfrm>
                       <a:off x="0" y="0"/>
-                      <a:ext cx="2994653" cy="8412480"/>
+                      <a:ext cx="3885672" cy="8412480"/>
                     </a:xfrm>
                     <a:prstGeom prst="rect">
                       <a:avLst/>
@@ -1423,6 +1481,11 @@
       </w:r>
     </w:p>
     <w:p>
+      <w:r>
+        <w:t xml:space="preserve">Na tela Alocação por Grupo, o administrador abre o seletor de avaliadores na linha do grupo, inclui ou retira avaliadores do pool — buscando por nome ou e-mail — e aciona "Salvar pool".</w:t>
+      </w:r>
+    </w:p>
+    <w:p>
       <w:pPr>
         <w:pStyle w:val="AxureHeadingBasic"/>
         <w:keepNext/>
@@ -1533,7 +1596,7 @@
               <w:spacing w:before="0" w:after="0"/>
             </w:pPr>
             <w:r>
-              <w:t xml:space="preserve">O pool de um grupo autoriza quem pode avaliar aquele grupo (categoria × modalidade × tipo de participante × submodalidade) na etapa; a alocação por inscrição só designa avaliadores presentes nesse pool. → ver AVL-ALO-04 (Alocar Avaliador à Inscrição), regra 7. *(a submodalidade foi acrescentada ao grupo em 2026-09-01: antes esta feature a omitia, e a definição divergia da usada na alocação por inscrição)*</w:t>
+              <w:t xml:space="preserve">O pool de um grupo autoriza quem pode avaliar aquele grupo (categoria × modalidade × tipo de participante × submodalidade) na etapa; a alocação por inscrição só designa avaliadores presentes nesse pool. → ver AVL-ALO-04 (Alocar Avaliador à Inscrição), regra 7. (a submodalidade foi acrescentada ao grupo em 2026-09-01: antes esta feature a omitia, e a definição divergia da usada na alocação por inscrição)</w:t>
             </w:r>
           </w:p>
         </w:tc>
@@ -2090,12 +2153,13 @@
         <w:tblLook w:val="04A0" w:firstRow="1" w:lastRow="0" w:firstColumn="1" w:lastColumn="0" w:noHBand="0" w:noVBand="1"/>
       </w:tblPr>
       <w:tblGrid>
-        <w:gridCol w:w="1500"/>
-        <w:gridCol w:w="1350"/>
-        <w:gridCol w:w="1150"/>
-        <w:gridCol w:w="1550"/>
-        <w:gridCol w:w="1250"/>
-        <w:gridCol w:w="2828"/>
+        <w:gridCol w:w="1341"/>
+        <w:gridCol w:w="1358"/>
+        <w:gridCol w:w="1648"/>
+        <w:gridCol w:w="1039"/>
+        <w:gridCol w:w="1305"/>
+        <w:gridCol w:w="1401"/>
+        <w:gridCol w:w="1536"/>
       </w:tblGrid>
       <w:tr>
         <w:trPr>
@@ -2103,7 +2167,7 @@
         </w:trPr>
         <w:tc>
           <w:tcPr>
-            <w:tcW w:w="1500" w:type="dxa"/>
+            <w:tcW w:w="1341" w:type="dxa"/>
             <w:shd w:val="clear" w:color="auto" w:fill="00B4C8"/>
             <w:vAlign w:val="center"/>
           </w:tcPr>
@@ -2127,7 +2191,7 @@
         </w:tc>
         <w:tc>
           <w:tcPr>
-            <w:tcW w:w="1350" w:type="dxa"/>
+            <w:tcW w:w="1358" w:type="dxa"/>
             <w:shd w:val="clear" w:color="auto" w:fill="00B4C8"/>
             <w:vAlign w:val="center"/>
           </w:tcPr>
@@ -2145,13 +2209,13 @@
                 <w:b/>
                 <w:bCs/>
               </w:rPr>
-              <w:t xml:space="preserve">Preenchimento</w:t>
-            </w:r>
-          </w:p>
-        </w:tc>
-        <w:tc>
-          <w:tcPr>
-            <w:tcW w:w="1150" w:type="dxa"/>
+              <w:t xml:space="preserve">Entidade</w:t>
+            </w:r>
+          </w:p>
+        </w:tc>
+        <w:tc>
+          <w:tcPr>
+            <w:tcW w:w="1648" w:type="dxa"/>
             <w:shd w:val="clear" w:color="auto" w:fill="00B4C8"/>
             <w:vAlign w:val="center"/>
           </w:tcPr>
@@ -2169,13 +2233,13 @@
                 <w:b/>
                 <w:bCs/>
               </w:rPr>
-              <w:t xml:space="preserve">Edição</w:t>
-            </w:r>
-          </w:p>
-        </w:tc>
-        <w:tc>
-          <w:tcPr>
-            <w:tcW w:w="1550" w:type="dxa"/>
+              <w:t xml:space="preserve">Preenchimento</w:t>
+            </w:r>
+          </w:p>
+        </w:tc>
+        <w:tc>
+          <w:tcPr>
+            <w:tcW w:w="1039" w:type="dxa"/>
             <w:shd w:val="clear" w:color="auto" w:fill="00B4C8"/>
             <w:vAlign w:val="center"/>
           </w:tcPr>
@@ -2193,13 +2257,13 @@
                 <w:b/>
                 <w:bCs/>
               </w:rPr>
-              <w:t xml:space="preserve">Tipo</w:t>
-            </w:r>
-          </w:p>
-        </w:tc>
-        <w:tc>
-          <w:tcPr>
-            <w:tcW w:w="1250" w:type="dxa"/>
+              <w:t xml:space="preserve">Edição</w:t>
+            </w:r>
+          </w:p>
+        </w:tc>
+        <w:tc>
+          <w:tcPr>
+            <w:tcW w:w="1305" w:type="dxa"/>
             <w:shd w:val="clear" w:color="auto" w:fill="00B4C8"/>
             <w:vAlign w:val="center"/>
           </w:tcPr>
@@ -2217,13 +2281,13 @@
                 <w:b/>
                 <w:bCs/>
               </w:rPr>
-              <w:t xml:space="preserve">Obrigatório</w:t>
-            </w:r>
-          </w:p>
-        </w:tc>
-        <w:tc>
-          <w:tcPr>
-            <w:tcW w:w="2828" w:type="dxa"/>
+              <w:t xml:space="preserve">Tipo</w:t>
+            </w:r>
+          </w:p>
+        </w:tc>
+        <w:tc>
+          <w:tcPr>
+            <w:tcW w:w="1401" w:type="dxa"/>
             <w:shd w:val="clear" w:color="auto" w:fill="00B4C8"/>
             <w:vAlign w:val="center"/>
           </w:tcPr>
@@ -2241,6 +2305,30 @@
                 <w:b/>
                 <w:bCs/>
               </w:rPr>
+              <w:t xml:space="preserve">Obrigatório</w:t>
+            </w:r>
+          </w:p>
+        </w:tc>
+        <w:tc>
+          <w:tcPr>
+            <w:tcW w:w="1536" w:type="dxa"/>
+            <w:shd w:val="clear" w:color="auto" w:fill="00B4C8"/>
+            <w:vAlign w:val="center"/>
+          </w:tcPr>
+          <w:p>
+            <w:pPr>
+              <w:spacing w:before="120" w:after="120"/>
+              <w:jc w:val="center"/>
+              <w:rPr>
+                <w:b/>
+                <w:bCs/>
+              </w:rPr>
+            </w:pPr>
+            <w:r>
+              <w:rPr>
+                <w:b/>
+                <w:bCs/>
+              </w:rPr>
               <w:t xml:space="preserve">Validação</w:t>
             </w:r>
           </w:p>
@@ -2249,7 +2337,7 @@
       <w:tr>
         <w:tc>
           <w:tcPr>
-            <w:tcW w:w="1500" w:type="dxa"/>
+            <w:tcW w:w="1341" w:type="dxa"/>
             <w:vAlign w:val="center"/>
           </w:tcPr>
           <w:p>
@@ -2263,7 +2351,21 @@
         </w:tc>
         <w:tc>
           <w:tcPr>
-            <w:tcW w:w="1350" w:type="dxa"/>
+            <w:tcW w:w="1358" w:type="dxa"/>
+            <w:vAlign w:val="center"/>
+          </w:tcPr>
+          <w:p>
+            <w:pPr>
+              <w:spacing w:before="0" w:after="0"/>
+            </w:pPr>
+            <w:r>
+              <w:t xml:space="preserve">externo: Portal corporativo</w:t>
+            </w:r>
+          </w:p>
+        </w:tc>
+        <w:tc>
+          <w:tcPr>
+            <w:tcW w:w="1648" w:type="dxa"/>
             <w:vAlign w:val="center"/>
           </w:tcPr>
           <w:p>
@@ -2277,7 +2379,7 @@
         </w:tc>
         <w:tc>
           <w:tcPr>
-            <w:tcW w:w="1150" w:type="dxa"/>
+            <w:tcW w:w="1039" w:type="dxa"/>
             <w:vAlign w:val="center"/>
           </w:tcPr>
           <w:p>
@@ -2291,21 +2393,21 @@
         </w:tc>
         <w:tc>
           <w:tcPr>
-            <w:tcW w:w="1550" w:type="dxa"/>
-            <w:vAlign w:val="center"/>
-          </w:tcPr>
-          <w:p>
-            <w:pPr>
-              <w:spacing w:before="0" w:after="0"/>
-            </w:pPr>
-            <w:r>
-              <w:t xml:space="preserve">multi-seleção → Avaliador</w:t>
-            </w:r>
-          </w:p>
-        </w:tc>
-        <w:tc>
-          <w:tcPr>
-            <w:tcW w:w="1250" w:type="dxa"/>
+            <w:tcW w:w="1305" w:type="dxa"/>
+            <w:vAlign w:val="center"/>
+          </w:tcPr>
+          <w:p>
+            <w:pPr>
+              <w:spacing w:before="0" w:after="0"/>
+            </w:pPr>
+            <w:r>
+              <w:t xml:space="preserve">seleção múltipla (usuários com perfil Avaliador)</w:t>
+            </w:r>
+          </w:p>
+        </w:tc>
+        <w:tc>
+          <w:tcPr>
+            <w:tcW w:w="1401" w:type="dxa"/>
             <w:vAlign w:val="center"/>
           </w:tcPr>
           <w:p>
@@ -2319,15 +2421,15 @@
         </w:tc>
         <w:tc>
           <w:tcPr>
-            <w:tcW w:w="2828" w:type="dxa"/>
-            <w:vAlign w:val="center"/>
-          </w:tcPr>
-          <w:p>
-            <w:pPr>
-              <w:spacing w:before="0" w:after="0"/>
-            </w:pPr>
-            <w:r>
-              <w:t xml:space="preserve">apenas usuários com perfil Avaliador; busca por nome e e-mail</w:t>
+            <w:tcW w:w="1536" w:type="dxa"/>
+            <w:vAlign w:val="center"/>
+          </w:tcPr>
+          <w:p>
+            <w:pPr>
+              <w:spacing w:before="0" w:after="0"/>
+            </w:pPr>
+            <w:r>
+              <w:t xml:space="preserve">apenas usuários com perfil Avaliador do cadastro corporativo; busca por nome e e-mail</w:t>
             </w:r>
           </w:p>
         </w:tc>
@@ -2627,6 +2729,11 @@
       </w:r>
     </w:p>
     <w:p>
+      <w:r>
+        <w:t xml:space="preserve">No menu Avaliação › Alocação por Inscrição, o administrador escolhe a premiação e a etapa, recorta a lista por grupo, estado ou situação da alocação, escolhe na linha de cada inscrição os avaliadores do pool e aciona "Salvar"; a ação "Projeto" abre, ao lado da lista, o detalhe da inscrição para consulta.</w:t>
+      </w:r>
+    </w:p>
+    <w:p>
       <w:pPr>
         <w:pStyle w:val="AxureHeadingBasic"/>
         <w:keepNext/>
@@ -2737,7 +2844,7 @@
               <w:spacing w:before="0" w:after="0"/>
             </w:pPr>
             <w:r>
-              <w:t xml:space="preserve">As inscrições elegíveis à alocação são, na primeira etapa, as inscrições validadas e, nas etapas seguintes, as inscrições classificadas na etapa anterior — a marca de premiada não determina o avanço. ⚠️ *(quem avança é o classificado — mesma leitura da SP05 adotada em AVL-APU-03, a confirmar com a liderança do prêmio)*</w:t>
+              <w:t xml:space="preserve">As inscrições elegíveis à alocação são, na primeira etapa, as inscrições validadas e, nas etapas seguintes, as inscrições classificadas na etapa anterior — a marca de premiada não determina o avanço. ⚠️ (quem avança é o classificado — mesma leitura da SP05 adotada em AVL-APU-03, a confirmar com a liderança do prêmio)</w:t>
             </w:r>
           </w:p>
         </w:tc>
@@ -2917,7 +3024,7 @@
               <w:spacing w:before="0" w:after="0"/>
             </w:pPr>
             <w:r>
-              <w:t xml:space="preserve">O grupo que qualifica uma inscrição para a alocação combina categoria, modalidade, tipo de participante e submodalidade da oferta a que a inscrição pertence. ✅ *(conferência com o código, 2026-08-28: as duas leituras coexistem por finalidades distintas — o grupo de alocação de AVL-ALO-01/AVL-ALO-02 é categoria × modalidade × tipo de participante, enquanto o grupo competitivo usado aqui e na apuração acrescenta a submodalidade, que no produto é o enquadramento. Ver global/CONFORMIDADE-CODIGO.md § 3.2.)*</w:t>
+              <w:t xml:space="preserve">O grupo que qualifica uma inscrição para a alocação combina categoria, modalidade, tipo de participante e submodalidade da oferta a que a inscrição pertence. ✅ (conferência com o código, 2026-08-28: as duas leituras coexistem por finalidades distintas — o grupo de alocação de AVL-ALO-01/AVL-ALO-02 é categoria × modalidade × tipo de participante, enquanto o grupo competitivo usado aqui e na apuração acrescenta a submodalidade, que no produto é o enquadramento. Ver global/CONFORMIDADE-CODIGO.md § 3.2.)</w:t>
             </w:r>
           </w:p>
         </w:tc>
@@ -3007,7 +3114,7 @@
               <w:spacing w:before="0" w:after="0"/>
             </w:pPr>
             <w:r>
-              <w:t xml:space="preserve">O detalhe do projeto consultado durante a alocação é somente leitura e apresenta o mesmo conteúdo definido para o detalhe da inscrição — identificação, respostas informadas pelo participante, anexos e equipe. → ver VAL-ANA-01 (Detalhar Inscrição), que é a definição única desse conteúdo *(decidido em 2026-09-01: as duas visões convergem, e uma alteração no detalhe da inscrição alcança também este drawer)*</w:t>
+              <w:t xml:space="preserve">O detalhe do projeto consultado durante a alocação é somente leitura e apresenta o mesmo conteúdo definido para o detalhe da inscrição — identificação, respostas informadas pelo participante, anexos e equipe. → ver VAL-ANA-01 (Detalhar Inscrição), que é a definição única desse conteúdo (decidido em 2026-09-01: as duas visões convergem, e uma alteração no detalhe da inscrição alcança também este drawer)</w:t>
             </w:r>
           </w:p>
         </w:tc>
@@ -3913,12 +4020,13 @@
         <w:tblLook w:val="04A0" w:firstRow="1" w:lastRow="0" w:firstColumn="1" w:lastColumn="0" w:noHBand="0" w:noVBand="1"/>
       </w:tblPr>
       <w:tblGrid>
-        <w:gridCol w:w="1500"/>
-        <w:gridCol w:w="1350"/>
-        <w:gridCol w:w="1150"/>
-        <w:gridCol w:w="1550"/>
-        <w:gridCol w:w="1250"/>
-        <w:gridCol w:w="2828"/>
+        <w:gridCol w:w="1304"/>
+        <w:gridCol w:w="1308"/>
+        <w:gridCol w:w="1611"/>
+        <w:gridCol w:w="1014"/>
+        <w:gridCol w:w="1636"/>
+        <w:gridCol w:w="1384"/>
+        <w:gridCol w:w="1371"/>
       </w:tblGrid>
       <w:tr>
         <w:trPr>
@@ -3926,7 +4034,7 @@
         </w:trPr>
         <w:tc>
           <w:tcPr>
-            <w:tcW w:w="1500" w:type="dxa"/>
+            <w:tcW w:w="1304" w:type="dxa"/>
             <w:shd w:val="clear" w:color="auto" w:fill="00B4C8"/>
             <w:vAlign w:val="center"/>
           </w:tcPr>
@@ -3950,7 +4058,7 @@
         </w:tc>
         <w:tc>
           <w:tcPr>
-            <w:tcW w:w="1350" w:type="dxa"/>
+            <w:tcW w:w="1308" w:type="dxa"/>
             <w:shd w:val="clear" w:color="auto" w:fill="00B4C8"/>
             <w:vAlign w:val="center"/>
           </w:tcPr>
@@ -3968,13 +4076,13 @@
                 <w:b/>
                 <w:bCs/>
               </w:rPr>
-              <w:t xml:space="preserve">Preenchimento</w:t>
-            </w:r>
-          </w:p>
-        </w:tc>
-        <w:tc>
-          <w:tcPr>
-            <w:tcW w:w="1150" w:type="dxa"/>
+              <w:t xml:space="preserve">Entidade</w:t>
+            </w:r>
+          </w:p>
+        </w:tc>
+        <w:tc>
+          <w:tcPr>
+            <w:tcW w:w="1611" w:type="dxa"/>
             <w:shd w:val="clear" w:color="auto" w:fill="00B4C8"/>
             <w:vAlign w:val="center"/>
           </w:tcPr>
@@ -3992,13 +4100,13 @@
                 <w:b/>
                 <w:bCs/>
               </w:rPr>
-              <w:t xml:space="preserve">Edição</w:t>
-            </w:r>
-          </w:p>
-        </w:tc>
-        <w:tc>
-          <w:tcPr>
-            <w:tcW w:w="1550" w:type="dxa"/>
+              <w:t xml:space="preserve">Preenchimento</w:t>
+            </w:r>
+          </w:p>
+        </w:tc>
+        <w:tc>
+          <w:tcPr>
+            <w:tcW w:w="1014" w:type="dxa"/>
             <w:shd w:val="clear" w:color="auto" w:fill="00B4C8"/>
             <w:vAlign w:val="center"/>
           </w:tcPr>
@@ -4016,13 +4124,13 @@
                 <w:b/>
                 <w:bCs/>
               </w:rPr>
-              <w:t xml:space="preserve">Tipo</w:t>
-            </w:r>
-          </w:p>
-        </w:tc>
-        <w:tc>
-          <w:tcPr>
-            <w:tcW w:w="1250" w:type="dxa"/>
+              <w:t xml:space="preserve">Edição</w:t>
+            </w:r>
+          </w:p>
+        </w:tc>
+        <w:tc>
+          <w:tcPr>
+            <w:tcW w:w="1636" w:type="dxa"/>
             <w:shd w:val="clear" w:color="auto" w:fill="00B4C8"/>
             <w:vAlign w:val="center"/>
           </w:tcPr>
@@ -4040,13 +4148,13 @@
                 <w:b/>
                 <w:bCs/>
               </w:rPr>
-              <w:t xml:space="preserve">Obrigatório</w:t>
-            </w:r>
-          </w:p>
-        </w:tc>
-        <w:tc>
-          <w:tcPr>
-            <w:tcW w:w="2828" w:type="dxa"/>
+              <w:t xml:space="preserve">Tipo</w:t>
+            </w:r>
+          </w:p>
+        </w:tc>
+        <w:tc>
+          <w:tcPr>
+            <w:tcW w:w="1384" w:type="dxa"/>
             <w:shd w:val="clear" w:color="auto" w:fill="00B4C8"/>
             <w:vAlign w:val="center"/>
           </w:tcPr>
@@ -4064,6 +4172,30 @@
                 <w:b/>
                 <w:bCs/>
               </w:rPr>
+              <w:t xml:space="preserve">Obrigatório</w:t>
+            </w:r>
+          </w:p>
+        </w:tc>
+        <w:tc>
+          <w:tcPr>
+            <w:tcW w:w="1371" w:type="dxa"/>
+            <w:shd w:val="clear" w:color="auto" w:fill="00B4C8"/>
+            <w:vAlign w:val="center"/>
+          </w:tcPr>
+          <w:p>
+            <w:pPr>
+              <w:spacing w:before="120" w:after="120"/>
+              <w:jc w:val="center"/>
+              <w:rPr>
+                <w:b/>
+                <w:bCs/>
+              </w:rPr>
+            </w:pPr>
+            <w:r>
+              <w:rPr>
+                <w:b/>
+                <w:bCs/>
+              </w:rPr>
               <w:t xml:space="preserve">Validação</w:t>
             </w:r>
           </w:p>
@@ -4072,7 +4204,7 @@
       <w:tr>
         <w:tc>
           <w:tcPr>
-            <w:tcW w:w="1500" w:type="dxa"/>
+            <w:tcW w:w="1304" w:type="dxa"/>
             <w:vAlign w:val="center"/>
           </w:tcPr>
           <w:p>
@@ -4086,7 +4218,21 @@
         </w:tc>
         <w:tc>
           <w:tcPr>
-            <w:tcW w:w="1350" w:type="dxa"/>
+            <w:tcW w:w="1308" w:type="dxa"/>
+            <w:vAlign w:val="center"/>
+          </w:tcPr>
+          <w:p>
+            <w:pPr>
+              <w:spacing w:before="0" w:after="0"/>
+            </w:pPr>
+            <w:r>
+              <w:t xml:space="preserve">Premiação</w:t>
+            </w:r>
+          </w:p>
+        </w:tc>
+        <w:tc>
+          <w:tcPr>
+            <w:tcW w:w="1611" w:type="dxa"/>
             <w:vAlign w:val="center"/>
           </w:tcPr>
           <w:p>
@@ -4100,7 +4246,7 @@
         </w:tc>
         <w:tc>
           <w:tcPr>
-            <w:tcW w:w="1150" w:type="dxa"/>
+            <w:tcW w:w="1014" w:type="dxa"/>
             <w:vAlign w:val="center"/>
           </w:tcPr>
           <w:p>
@@ -4114,7 +4260,7 @@
         </w:tc>
         <w:tc>
           <w:tcPr>
-            <w:tcW w:w="1550" w:type="dxa"/>
+            <w:tcW w:w="1636" w:type="dxa"/>
             <w:vAlign w:val="center"/>
           </w:tcPr>
           <w:p>
@@ -4128,7 +4274,7 @@
         </w:tc>
         <w:tc>
           <w:tcPr>
-            <w:tcW w:w="1250" w:type="dxa"/>
+            <w:tcW w:w="1384" w:type="dxa"/>
             <w:vAlign w:val="center"/>
           </w:tcPr>
           <w:p>
@@ -4142,7 +4288,7 @@
         </w:tc>
         <w:tc>
           <w:tcPr>
-            <w:tcW w:w="2828" w:type="dxa"/>
+            <w:tcW w:w="1371" w:type="dxa"/>
             <w:vAlign w:val="center"/>
           </w:tcPr>
           <w:p>
@@ -4158,7 +4304,7 @@
       <w:tr>
         <w:tc>
           <w:tcPr>
-            <w:tcW w:w="1500" w:type="dxa"/>
+            <w:tcW w:w="1304" w:type="dxa"/>
             <w:vAlign w:val="center"/>
           </w:tcPr>
           <w:p>
@@ -4172,7 +4318,21 @@
         </w:tc>
         <w:tc>
           <w:tcPr>
-            <w:tcW w:w="1350" w:type="dxa"/>
+            <w:tcW w:w="1308" w:type="dxa"/>
+            <w:vAlign w:val="center"/>
+          </w:tcPr>
+          <w:p>
+            <w:pPr>
+              <w:spacing w:before="0" w:after="0"/>
+            </w:pPr>
+            <w:r>
+              <w:t xml:space="preserve">Etapa</w:t>
+            </w:r>
+          </w:p>
+        </w:tc>
+        <w:tc>
+          <w:tcPr>
+            <w:tcW w:w="1611" w:type="dxa"/>
             <w:vAlign w:val="center"/>
           </w:tcPr>
           <w:p>
@@ -4186,7 +4346,7 @@
         </w:tc>
         <w:tc>
           <w:tcPr>
-            <w:tcW w:w="1150" w:type="dxa"/>
+            <w:tcW w:w="1014" w:type="dxa"/>
             <w:vAlign w:val="center"/>
           </w:tcPr>
           <w:p>
@@ -4200,7 +4360,7 @@
         </w:tc>
         <w:tc>
           <w:tcPr>
-            <w:tcW w:w="1550" w:type="dxa"/>
+            <w:tcW w:w="1636" w:type="dxa"/>
             <w:vAlign w:val="center"/>
           </w:tcPr>
           <w:p>
@@ -4214,7 +4374,7 @@
         </w:tc>
         <w:tc>
           <w:tcPr>
-            <w:tcW w:w="1250" w:type="dxa"/>
+            <w:tcW w:w="1384" w:type="dxa"/>
             <w:vAlign w:val="center"/>
           </w:tcPr>
           <w:p>
@@ -4228,7 +4388,7 @@
         </w:tc>
         <w:tc>
           <w:tcPr>
-            <w:tcW w:w="2828" w:type="dxa"/>
+            <w:tcW w:w="1371" w:type="dxa"/>
             <w:vAlign w:val="center"/>
           </w:tcPr>
           <w:p>
@@ -4244,7 +4404,7 @@
       <w:tr>
         <w:tc>
           <w:tcPr>
-            <w:tcW w:w="1500" w:type="dxa"/>
+            <w:tcW w:w="1304" w:type="dxa"/>
             <w:vAlign w:val="center"/>
           </w:tcPr>
           <w:p>
@@ -4258,7 +4418,21 @@
         </w:tc>
         <w:tc>
           <w:tcPr>
-            <w:tcW w:w="1350" w:type="dxa"/>
+            <w:tcW w:w="1308" w:type="dxa"/>
+            <w:vAlign w:val="center"/>
+          </w:tcPr>
+          <w:p>
+            <w:pPr>
+              <w:spacing w:before="0" w:after="0"/>
+            </w:pPr>
+            <w:r>
+              <w:t xml:space="preserve">Alocação de Avaliadores</w:t>
+            </w:r>
+          </w:p>
+        </w:tc>
+        <w:tc>
+          <w:tcPr>
+            <w:tcW w:w="1611" w:type="dxa"/>
             <w:vAlign w:val="center"/>
           </w:tcPr>
           <w:p>
@@ -4272,7 +4446,7 @@
         </w:tc>
         <w:tc>
           <w:tcPr>
-            <w:tcW w:w="1150" w:type="dxa"/>
+            <w:tcW w:w="1014" w:type="dxa"/>
             <w:vAlign w:val="center"/>
           </w:tcPr>
           <w:p>
@@ -4286,21 +4460,21 @@
         </w:tc>
         <w:tc>
           <w:tcPr>
-            <w:tcW w:w="1550" w:type="dxa"/>
-            <w:vAlign w:val="center"/>
-          </w:tcPr>
-          <w:p>
-            <w:pPr>
-              <w:spacing w:before="0" w:after="0"/>
-            </w:pPr>
-            <w:r>
-              <w:t xml:space="preserve">multi-seleção → Avaliador</w:t>
-            </w:r>
-          </w:p>
-        </w:tc>
-        <w:tc>
-          <w:tcPr>
-            <w:tcW w:w="1250" w:type="dxa"/>
+            <w:tcW w:w="1636" w:type="dxa"/>
+            <w:vAlign w:val="center"/>
+          </w:tcPr>
+          <w:p>
+            <w:pPr>
+              <w:spacing w:before="0" w:after="0"/>
+            </w:pPr>
+            <w:r>
+              <w:t xml:space="preserve">multi-seleção → Alocação de Avaliadores (avaliadores do pool)</w:t>
+            </w:r>
+          </w:p>
+        </w:tc>
+        <w:tc>
+          <w:tcPr>
+            <w:tcW w:w="1384" w:type="dxa"/>
             <w:vAlign w:val="center"/>
           </w:tcPr>
           <w:p>
@@ -4314,7 +4488,7 @@
         </w:tc>
         <w:tc>
           <w:tcPr>
-            <w:tcW w:w="2828" w:type="dxa"/>
+            <w:tcW w:w="1371" w:type="dxa"/>
             <w:vAlign w:val="center"/>
           </w:tcPr>
           <w:p>
@@ -4330,7 +4504,7 @@
       <w:tr>
         <w:tc>
           <w:tcPr>
-            <w:tcW w:w="1500" w:type="dxa"/>
+            <w:tcW w:w="1304" w:type="dxa"/>
             <w:vAlign w:val="center"/>
           </w:tcPr>
           <w:p>
@@ -4344,7 +4518,21 @@
         </w:tc>
         <w:tc>
           <w:tcPr>
-            <w:tcW w:w="1350" w:type="dxa"/>
+            <w:tcW w:w="1308" w:type="dxa"/>
+            <w:vAlign w:val="center"/>
+          </w:tcPr>
+          <w:p>
+            <w:pPr>
+              <w:spacing w:before="0" w:after="0"/>
+            </w:pPr>
+            <w:r>
+              <w:t xml:space="preserve">derivado ↓</w:t>
+            </w:r>
+          </w:p>
+        </w:tc>
+        <w:tc>
+          <w:tcPr>
+            <w:tcW w:w="1611" w:type="dxa"/>
             <w:vAlign w:val="center"/>
           </w:tcPr>
           <w:p>
@@ -4358,7 +4546,7 @@
         </w:tc>
         <w:tc>
           <w:tcPr>
-            <w:tcW w:w="1150" w:type="dxa"/>
+            <w:tcW w:w="1014" w:type="dxa"/>
             <w:vAlign w:val="center"/>
           </w:tcPr>
           <w:p>
@@ -4372,21 +4560,21 @@
         </w:tc>
         <w:tc>
           <w:tcPr>
-            <w:tcW w:w="1550" w:type="dxa"/>
-            <w:vAlign w:val="center"/>
-          </w:tcPr>
-          <w:p>
-            <w:pPr>
-              <w:spacing w:before="0" w:after="0"/>
-            </w:pPr>
-            <w:r>
-              <w:t xml:space="preserve">seleção múltipla → Grupo (categoria, modalidade, tipo de participante e submodalidade)</w:t>
-            </w:r>
-          </w:p>
-        </w:tc>
-        <w:tc>
-          <w:tcPr>
-            <w:tcW w:w="1250" w:type="dxa"/>
+            <w:tcW w:w="1636" w:type="dxa"/>
+            <w:vAlign w:val="center"/>
+          </w:tcPr>
+          <w:p>
+            <w:pPr>
+              <w:spacing w:before="0" w:after="0"/>
+            </w:pPr>
+            <w:r>
+              <w:t xml:space="preserve">seleção múltipla de grupos (categoria, modalidade, tipo de participante e submodalidade)</w:t>
+            </w:r>
+          </w:p>
+        </w:tc>
+        <w:tc>
+          <w:tcPr>
+            <w:tcW w:w="1384" w:type="dxa"/>
             <w:vAlign w:val="center"/>
           </w:tcPr>
           <w:p>
@@ -4400,7 +4588,7 @@
         </w:tc>
         <w:tc>
           <w:tcPr>
-            <w:tcW w:w="2828" w:type="dxa"/>
+            <w:tcW w:w="1371" w:type="dxa"/>
             <w:vAlign w:val="center"/>
           </w:tcPr>
           <w:p>
@@ -4416,7 +4604,7 @@
       <w:tr>
         <w:tc>
           <w:tcPr>
-            <w:tcW w:w="1500" w:type="dxa"/>
+            <w:tcW w:w="1304" w:type="dxa"/>
             <w:vAlign w:val="center"/>
           </w:tcPr>
           <w:p>
@@ -4430,7 +4618,21 @@
         </w:tc>
         <w:tc>
           <w:tcPr>
-            <w:tcW w:w="1350" w:type="dxa"/>
+            <w:tcW w:w="1308" w:type="dxa"/>
+            <w:vAlign w:val="center"/>
+          </w:tcPr>
+          <w:p>
+            <w:pPr>
+              <w:spacing w:before="0" w:after="0"/>
+            </w:pPr>
+            <w:r>
+              <w:t xml:space="preserve">Unidade Federativa</w:t>
+            </w:r>
+          </w:p>
+        </w:tc>
+        <w:tc>
+          <w:tcPr>
+            <w:tcW w:w="1611" w:type="dxa"/>
             <w:vAlign w:val="center"/>
           </w:tcPr>
           <w:p>
@@ -4444,7 +4646,7 @@
         </w:tc>
         <w:tc>
           <w:tcPr>
-            <w:tcW w:w="1150" w:type="dxa"/>
+            <w:tcW w:w="1014" w:type="dxa"/>
             <w:vAlign w:val="center"/>
           </w:tcPr>
           <w:p>
@@ -4458,21 +4660,21 @@
         </w:tc>
         <w:tc>
           <w:tcPr>
-            <w:tcW w:w="1550" w:type="dxa"/>
-            <w:vAlign w:val="center"/>
-          </w:tcPr>
-          <w:p>
-            <w:pPr>
-              <w:spacing w:before="0" w:after="0"/>
-            </w:pPr>
-            <w:r>
-              <w:t xml:space="preserve">seleção múltipla → UF, com a opção Nacional</w:t>
-            </w:r>
-          </w:p>
-        </w:tc>
-        <w:tc>
-          <w:tcPr>
-            <w:tcW w:w="1250" w:type="dxa"/>
+            <w:tcW w:w="1636" w:type="dxa"/>
+            <w:vAlign w:val="center"/>
+          </w:tcPr>
+          <w:p>
+            <w:pPr>
+              <w:spacing w:before="0" w:after="0"/>
+            </w:pPr>
+            <w:r>
+              <w:t xml:space="preserve">seleção múltipla → Unidade Federativa</w:t>
+            </w:r>
+          </w:p>
+        </w:tc>
+        <w:tc>
+          <w:tcPr>
+            <w:tcW w:w="1384" w:type="dxa"/>
             <w:vAlign w:val="center"/>
           </w:tcPr>
           <w:p>
@@ -4486,15 +4688,15 @@
         </w:tc>
         <w:tc>
           <w:tcPr>
-            <w:tcW w:w="2828" w:type="dxa"/>
-            <w:vAlign w:val="center"/>
-          </w:tcPr>
-          <w:p>
-            <w:pPr>
-              <w:spacing w:before="0" w:after="0"/>
-            </w:pPr>
-            <w:r>
-              <w:t xml:space="preserve">UFs alcançadas pelo perfil; Nacional reúne as inscrições sem unidade federativa</w:t>
+            <w:tcW w:w="1371" w:type="dxa"/>
+            <w:vAlign w:val="center"/>
+          </w:tcPr>
+          <w:p>
+            <w:pPr>
+              <w:spacing w:before="0" w:after="0"/>
+            </w:pPr>
+            <w:r>
+              <w:t xml:space="preserve">UFs alcançadas pelo perfil, mais a opção Nacional, que reúne as inscrições sem unidade federativa</w:t>
             </w:r>
           </w:p>
         </w:tc>
@@ -4502,7 +4704,7 @@
       <w:tr>
         <w:tc>
           <w:tcPr>
-            <w:tcW w:w="1500" w:type="dxa"/>
+            <w:tcW w:w="1304" w:type="dxa"/>
             <w:vAlign w:val="center"/>
           </w:tcPr>
           <w:p>
@@ -4516,7 +4718,21 @@
         </w:tc>
         <w:tc>
           <w:tcPr>
-            <w:tcW w:w="1350" w:type="dxa"/>
+            <w:tcW w:w="1308" w:type="dxa"/>
+            <w:vAlign w:val="center"/>
+          </w:tcPr>
+          <w:p>
+            <w:pPr>
+              <w:spacing w:before="0" w:after="0"/>
+            </w:pPr>
+            <w:r>
+              <w:t xml:space="preserve">dado de código</w:t>
+            </w:r>
+          </w:p>
+        </w:tc>
+        <w:tc>
+          <w:tcPr>
+            <w:tcW w:w="1611" w:type="dxa"/>
             <w:vAlign w:val="center"/>
           </w:tcPr>
           <w:p>
@@ -4530,7 +4746,7 @@
         </w:tc>
         <w:tc>
           <w:tcPr>
-            <w:tcW w:w="1150" w:type="dxa"/>
+            <w:tcW w:w="1014" w:type="dxa"/>
             <w:vAlign w:val="center"/>
           </w:tcPr>
           <w:p>
@@ -4544,7 +4760,7 @@
         </w:tc>
         <w:tc>
           <w:tcPr>
-            <w:tcW w:w="1550" w:type="dxa"/>
+            <w:tcW w:w="1636" w:type="dxa"/>
             <w:vAlign w:val="center"/>
           </w:tcPr>
           <w:p>
@@ -4558,7 +4774,7 @@
         </w:tc>
         <w:tc>
           <w:tcPr>
-            <w:tcW w:w="1250" w:type="dxa"/>
+            <w:tcW w:w="1384" w:type="dxa"/>
             <w:vAlign w:val="center"/>
           </w:tcPr>
           <w:p>
@@ -4572,7 +4788,7 @@
         </w:tc>
         <w:tc>
           <w:tcPr>
-            <w:tcW w:w="2828" w:type="dxa"/>
+            <w:tcW w:w="1371" w:type="dxa"/>
             <w:vAlign w:val="center"/>
           </w:tcPr>
           <w:p>
@@ -4968,6 +5184,11 @@
       </w:r>
     </w:p>
     <w:p>
+      <w:r>
+        <w:t xml:space="preserve">Na tela Alocação por Grupo, o administrador aciona "Cadastrar avaliador", informa login, nome e e-mail — e, se quiser, CPF, cargo e as UFs vinculadas —, decide se o convite segue por e-mail e salva.</w:t>
+      </w:r>
+    </w:p>
+    <w:p>
       <w:pPr>
         <w:pStyle w:val="AxureHeadingBasic"/>
         <w:keepNext/>
@@ -5580,12 +5801,13 @@
         <w:tblLook w:val="04A0" w:firstRow="1" w:lastRow="0" w:firstColumn="1" w:lastColumn="0" w:noHBand="0" w:noVBand="1"/>
       </w:tblPr>
       <w:tblGrid>
-        <w:gridCol w:w="1500"/>
-        <w:gridCol w:w="1350"/>
-        <w:gridCol w:w="1150"/>
-        <w:gridCol w:w="1550"/>
-        <w:gridCol w:w="1250"/>
-        <w:gridCol w:w="2828"/>
+        <w:gridCol w:w="1187"/>
+        <w:gridCol w:w="1278"/>
+        <w:gridCol w:w="1583"/>
+        <w:gridCol w:w="995"/>
+        <w:gridCol w:w="1461"/>
+        <w:gridCol w:w="1370"/>
+        <w:gridCol w:w="1754"/>
       </w:tblGrid>
       <w:tr>
         <w:trPr>
@@ -5593,7 +5815,7 @@
         </w:trPr>
         <w:tc>
           <w:tcPr>
-            <w:tcW w:w="1500" w:type="dxa"/>
+            <w:tcW w:w="1187" w:type="dxa"/>
             <w:shd w:val="clear" w:color="auto" w:fill="00B4C8"/>
             <w:vAlign w:val="center"/>
           </w:tcPr>
@@ -5617,7 +5839,7 @@
         </w:tc>
         <w:tc>
           <w:tcPr>
-            <w:tcW w:w="1350" w:type="dxa"/>
+            <w:tcW w:w="1278" w:type="dxa"/>
             <w:shd w:val="clear" w:color="auto" w:fill="00B4C8"/>
             <w:vAlign w:val="center"/>
           </w:tcPr>
@@ -5635,13 +5857,13 @@
                 <w:b/>
                 <w:bCs/>
               </w:rPr>
-              <w:t xml:space="preserve">Preenchimento</w:t>
-            </w:r>
-          </w:p>
-        </w:tc>
-        <w:tc>
-          <w:tcPr>
-            <w:tcW w:w="1150" w:type="dxa"/>
+              <w:t xml:space="preserve">Entidade</w:t>
+            </w:r>
+          </w:p>
+        </w:tc>
+        <w:tc>
+          <w:tcPr>
+            <w:tcW w:w="1583" w:type="dxa"/>
             <w:shd w:val="clear" w:color="auto" w:fill="00B4C8"/>
             <w:vAlign w:val="center"/>
           </w:tcPr>
@@ -5659,13 +5881,13 @@
                 <w:b/>
                 <w:bCs/>
               </w:rPr>
-              <w:t xml:space="preserve">Edição</w:t>
-            </w:r>
-          </w:p>
-        </w:tc>
-        <w:tc>
-          <w:tcPr>
-            <w:tcW w:w="1550" w:type="dxa"/>
+              <w:t xml:space="preserve">Preenchimento</w:t>
+            </w:r>
+          </w:p>
+        </w:tc>
+        <w:tc>
+          <w:tcPr>
+            <w:tcW w:w="995" w:type="dxa"/>
             <w:shd w:val="clear" w:color="auto" w:fill="00B4C8"/>
             <w:vAlign w:val="center"/>
           </w:tcPr>
@@ -5683,13 +5905,13 @@
                 <w:b/>
                 <w:bCs/>
               </w:rPr>
-              <w:t xml:space="preserve">Tipo</w:t>
-            </w:r>
-          </w:p>
-        </w:tc>
-        <w:tc>
-          <w:tcPr>
-            <w:tcW w:w="1250" w:type="dxa"/>
+              <w:t xml:space="preserve">Edição</w:t>
+            </w:r>
+          </w:p>
+        </w:tc>
+        <w:tc>
+          <w:tcPr>
+            <w:tcW w:w="1461" w:type="dxa"/>
             <w:shd w:val="clear" w:color="auto" w:fill="00B4C8"/>
             <w:vAlign w:val="center"/>
           </w:tcPr>
@@ -5707,13 +5929,13 @@
                 <w:b/>
                 <w:bCs/>
               </w:rPr>
-              <w:t xml:space="preserve">Obrigatório</w:t>
-            </w:r>
-          </w:p>
-        </w:tc>
-        <w:tc>
-          <w:tcPr>
-            <w:tcW w:w="2828" w:type="dxa"/>
+              <w:t xml:space="preserve">Tipo</w:t>
+            </w:r>
+          </w:p>
+        </w:tc>
+        <w:tc>
+          <w:tcPr>
+            <w:tcW w:w="1370" w:type="dxa"/>
             <w:shd w:val="clear" w:color="auto" w:fill="00B4C8"/>
             <w:vAlign w:val="center"/>
           </w:tcPr>
@@ -5731,6 +5953,30 @@
                 <w:b/>
                 <w:bCs/>
               </w:rPr>
+              <w:t xml:space="preserve">Obrigatório</w:t>
+            </w:r>
+          </w:p>
+        </w:tc>
+        <w:tc>
+          <w:tcPr>
+            <w:tcW w:w="1754" w:type="dxa"/>
+            <w:shd w:val="clear" w:color="auto" w:fill="00B4C8"/>
+            <w:vAlign w:val="center"/>
+          </w:tcPr>
+          <w:p>
+            <w:pPr>
+              <w:spacing w:before="120" w:after="120"/>
+              <w:jc w:val="center"/>
+              <w:rPr>
+                <w:b/>
+                <w:bCs/>
+              </w:rPr>
+            </w:pPr>
+            <w:r>
+              <w:rPr>
+                <w:b/>
+                <w:bCs/>
+              </w:rPr>
               <w:t xml:space="preserve">Validação</w:t>
             </w:r>
           </w:p>
@@ -5739,7 +5985,7 @@
       <w:tr>
         <w:tc>
           <w:tcPr>
-            <w:tcW w:w="1500" w:type="dxa"/>
+            <w:tcW w:w="1187" w:type="dxa"/>
             <w:vAlign w:val="center"/>
           </w:tcPr>
           <w:p>
@@ -5753,7 +5999,21 @@
         </w:tc>
         <w:tc>
           <w:tcPr>
-            <w:tcW w:w="1350" w:type="dxa"/>
+            <w:tcW w:w="1278" w:type="dxa"/>
+            <w:vAlign w:val="center"/>
+          </w:tcPr>
+          <w:p>
+            <w:pPr>
+              <w:spacing w:before="0" w:after="0"/>
+            </w:pPr>
+            <w:r>
+              <w:t xml:space="preserve">externo: Portal corporativo</w:t>
+            </w:r>
+          </w:p>
+        </w:tc>
+        <w:tc>
+          <w:tcPr>
+            <w:tcW w:w="1583" w:type="dxa"/>
             <w:vAlign w:val="center"/>
           </w:tcPr>
           <w:p>
@@ -5767,7 +6027,7 @@
         </w:tc>
         <w:tc>
           <w:tcPr>
-            <w:tcW w:w="1150" w:type="dxa"/>
+            <w:tcW w:w="995" w:type="dxa"/>
             <w:vAlign w:val="center"/>
           </w:tcPr>
           <w:p>
@@ -5781,7 +6041,7 @@
         </w:tc>
         <w:tc>
           <w:tcPr>
-            <w:tcW w:w="1550" w:type="dxa"/>
+            <w:tcW w:w="1461" w:type="dxa"/>
             <w:vAlign w:val="center"/>
           </w:tcPr>
           <w:p>
@@ -5795,7 +6055,7 @@
         </w:tc>
         <w:tc>
           <w:tcPr>
-            <w:tcW w:w="1250" w:type="dxa"/>
+            <w:tcW w:w="1370" w:type="dxa"/>
             <w:vAlign w:val="center"/>
           </w:tcPr>
           <w:p>
@@ -5809,7 +6069,7 @@
         </w:tc>
         <w:tc>
           <w:tcPr>
-            <w:tcW w:w="2828" w:type="dxa"/>
+            <w:tcW w:w="1754" w:type="dxa"/>
             <w:vAlign w:val="center"/>
           </w:tcPr>
           <w:p>
@@ -5825,7 +6085,7 @@
       <w:tr>
         <w:tc>
           <w:tcPr>
-            <w:tcW w:w="1500" w:type="dxa"/>
+            <w:tcW w:w="1187" w:type="dxa"/>
             <w:vAlign w:val="center"/>
           </w:tcPr>
           <w:p>
@@ -5839,7 +6099,21 @@
         </w:tc>
         <w:tc>
           <w:tcPr>
-            <w:tcW w:w="1350" w:type="dxa"/>
+            <w:tcW w:w="1278" w:type="dxa"/>
+            <w:vAlign w:val="center"/>
+          </w:tcPr>
+          <w:p>
+            <w:pPr>
+              <w:spacing w:before="0" w:after="0"/>
+            </w:pPr>
+            <w:r>
+              <w:t xml:space="preserve">externo: Portal corporativo</w:t>
+            </w:r>
+          </w:p>
+        </w:tc>
+        <w:tc>
+          <w:tcPr>
+            <w:tcW w:w="1583" w:type="dxa"/>
             <w:vAlign w:val="center"/>
           </w:tcPr>
           <w:p>
@@ -5853,7 +6127,7 @@
         </w:tc>
         <w:tc>
           <w:tcPr>
-            <w:tcW w:w="1150" w:type="dxa"/>
+            <w:tcW w:w="995" w:type="dxa"/>
             <w:vAlign w:val="center"/>
           </w:tcPr>
           <w:p>
@@ -5867,7 +6141,7 @@
         </w:tc>
         <w:tc>
           <w:tcPr>
-            <w:tcW w:w="1550" w:type="dxa"/>
+            <w:tcW w:w="1461" w:type="dxa"/>
             <w:vAlign w:val="center"/>
           </w:tcPr>
           <w:p>
@@ -5881,7 +6155,7 @@
         </w:tc>
         <w:tc>
           <w:tcPr>
-            <w:tcW w:w="1250" w:type="dxa"/>
+            <w:tcW w:w="1370" w:type="dxa"/>
             <w:vAlign w:val="center"/>
           </w:tcPr>
           <w:p>
@@ -5895,7 +6169,7 @@
         </w:tc>
         <w:tc>
           <w:tcPr>
-            <w:tcW w:w="2828" w:type="dxa"/>
+            <w:tcW w:w="1754" w:type="dxa"/>
             <w:vAlign w:val="center"/>
           </w:tcPr>
           <w:p>
@@ -5911,7 +6185,7 @@
       <w:tr>
         <w:tc>
           <w:tcPr>
-            <w:tcW w:w="1500" w:type="dxa"/>
+            <w:tcW w:w="1187" w:type="dxa"/>
             <w:vAlign w:val="center"/>
           </w:tcPr>
           <w:p>
@@ -5925,7 +6199,21 @@
         </w:tc>
         <w:tc>
           <w:tcPr>
-            <w:tcW w:w="1350" w:type="dxa"/>
+            <w:tcW w:w="1278" w:type="dxa"/>
+            <w:vAlign w:val="center"/>
+          </w:tcPr>
+          <w:p>
+            <w:pPr>
+              <w:spacing w:before="0" w:after="0"/>
+            </w:pPr>
+            <w:r>
+              <w:t xml:space="preserve">externo: Portal corporativo</w:t>
+            </w:r>
+          </w:p>
+        </w:tc>
+        <w:tc>
+          <w:tcPr>
+            <w:tcW w:w="1583" w:type="dxa"/>
             <w:vAlign w:val="center"/>
           </w:tcPr>
           <w:p>
@@ -5939,7 +6227,7 @@
         </w:tc>
         <w:tc>
           <w:tcPr>
-            <w:tcW w:w="1150" w:type="dxa"/>
+            <w:tcW w:w="995" w:type="dxa"/>
             <w:vAlign w:val="center"/>
           </w:tcPr>
           <w:p>
@@ -5953,7 +6241,7 @@
         </w:tc>
         <w:tc>
           <w:tcPr>
-            <w:tcW w:w="1550" w:type="dxa"/>
+            <w:tcW w:w="1461" w:type="dxa"/>
             <w:vAlign w:val="center"/>
           </w:tcPr>
           <w:p>
@@ -5967,7 +6255,7 @@
         </w:tc>
         <w:tc>
           <w:tcPr>
-            <w:tcW w:w="1250" w:type="dxa"/>
+            <w:tcW w:w="1370" w:type="dxa"/>
             <w:vAlign w:val="center"/>
           </w:tcPr>
           <w:p>
@@ -5981,7 +6269,7 @@
         </w:tc>
         <w:tc>
           <w:tcPr>
-            <w:tcW w:w="2828" w:type="dxa"/>
+            <w:tcW w:w="1754" w:type="dxa"/>
             <w:vAlign w:val="center"/>
           </w:tcPr>
           <w:p>
@@ -5997,7 +6285,7 @@
       <w:tr>
         <w:tc>
           <w:tcPr>
-            <w:tcW w:w="1500" w:type="dxa"/>
+            <w:tcW w:w="1187" w:type="dxa"/>
             <w:vAlign w:val="center"/>
           </w:tcPr>
           <w:p>
@@ -6011,7 +6299,21 @@
         </w:tc>
         <w:tc>
           <w:tcPr>
-            <w:tcW w:w="1350" w:type="dxa"/>
+            <w:tcW w:w="1278" w:type="dxa"/>
+            <w:vAlign w:val="center"/>
+          </w:tcPr>
+          <w:p>
+            <w:pPr>
+              <w:spacing w:before="0" w:after="0"/>
+            </w:pPr>
+            <w:r>
+              <w:t xml:space="preserve">externo: Portal corporativo</w:t>
+            </w:r>
+          </w:p>
+        </w:tc>
+        <w:tc>
+          <w:tcPr>
+            <w:tcW w:w="1583" w:type="dxa"/>
             <w:vAlign w:val="center"/>
           </w:tcPr>
           <w:p>
@@ -6025,7 +6327,7 @@
         </w:tc>
         <w:tc>
           <w:tcPr>
-            <w:tcW w:w="1150" w:type="dxa"/>
+            <w:tcW w:w="995" w:type="dxa"/>
             <w:vAlign w:val="center"/>
           </w:tcPr>
           <w:p>
@@ -6039,7 +6341,7 @@
         </w:tc>
         <w:tc>
           <w:tcPr>
-            <w:tcW w:w="1550" w:type="dxa"/>
+            <w:tcW w:w="1461" w:type="dxa"/>
             <w:vAlign w:val="center"/>
           </w:tcPr>
           <w:p>
@@ -6053,7 +6355,7 @@
         </w:tc>
         <w:tc>
           <w:tcPr>
-            <w:tcW w:w="1250" w:type="dxa"/>
+            <w:tcW w:w="1370" w:type="dxa"/>
             <w:vAlign w:val="center"/>
           </w:tcPr>
           <w:p>
@@ -6067,7 +6369,7 @@
         </w:tc>
         <w:tc>
           <w:tcPr>
-            <w:tcW w:w="2828" w:type="dxa"/>
+            <w:tcW w:w="1754" w:type="dxa"/>
             <w:vAlign w:val="center"/>
           </w:tcPr>
           <w:p>
@@ -6083,7 +6385,7 @@
       <w:tr>
         <w:tc>
           <w:tcPr>
-            <w:tcW w:w="1500" w:type="dxa"/>
+            <w:tcW w:w="1187" w:type="dxa"/>
             <w:vAlign w:val="center"/>
           </w:tcPr>
           <w:p>
@@ -6097,7 +6399,21 @@
         </w:tc>
         <w:tc>
           <w:tcPr>
-            <w:tcW w:w="1350" w:type="dxa"/>
+            <w:tcW w:w="1278" w:type="dxa"/>
+            <w:vAlign w:val="center"/>
+          </w:tcPr>
+          <w:p>
+            <w:pPr>
+              <w:spacing w:before="0" w:after="0"/>
+            </w:pPr>
+            <w:r>
+              <w:t xml:space="preserve">externo: Portal corporativo</w:t>
+            </w:r>
+          </w:p>
+        </w:tc>
+        <w:tc>
+          <w:tcPr>
+            <w:tcW w:w="1583" w:type="dxa"/>
             <w:vAlign w:val="center"/>
           </w:tcPr>
           <w:p>
@@ -6111,7 +6427,7 @@
         </w:tc>
         <w:tc>
           <w:tcPr>
-            <w:tcW w:w="1150" w:type="dxa"/>
+            <w:tcW w:w="995" w:type="dxa"/>
             <w:vAlign w:val="center"/>
           </w:tcPr>
           <w:p>
@@ -6125,7 +6441,7 @@
         </w:tc>
         <w:tc>
           <w:tcPr>
-            <w:tcW w:w="1550" w:type="dxa"/>
+            <w:tcW w:w="1461" w:type="dxa"/>
             <w:vAlign w:val="center"/>
           </w:tcPr>
           <w:p>
@@ -6139,7 +6455,7 @@
         </w:tc>
         <w:tc>
           <w:tcPr>
-            <w:tcW w:w="1250" w:type="dxa"/>
+            <w:tcW w:w="1370" w:type="dxa"/>
             <w:vAlign w:val="center"/>
           </w:tcPr>
           <w:p>
@@ -6153,7 +6469,7 @@
         </w:tc>
         <w:tc>
           <w:tcPr>
-            <w:tcW w:w="2828" w:type="dxa"/>
+            <w:tcW w:w="1754" w:type="dxa"/>
             <w:vAlign w:val="center"/>
           </w:tcPr>
           <w:p>
@@ -6169,7 +6485,7 @@
       <w:tr>
         <w:tc>
           <w:tcPr>
-            <w:tcW w:w="1500" w:type="dxa"/>
+            <w:tcW w:w="1187" w:type="dxa"/>
             <w:vAlign w:val="center"/>
           </w:tcPr>
           <w:p>
@@ -6183,7 +6499,21 @@
         </w:tc>
         <w:tc>
           <w:tcPr>
-            <w:tcW w:w="1350" w:type="dxa"/>
+            <w:tcW w:w="1278" w:type="dxa"/>
+            <w:vAlign w:val="center"/>
+          </w:tcPr>
+          <w:p>
+            <w:pPr>
+              <w:spacing w:before="0" w:after="0"/>
+            </w:pPr>
+            <w:r>
+              <w:t xml:space="preserve">externo: Portal corporativo</w:t>
+            </w:r>
+          </w:p>
+        </w:tc>
+        <w:tc>
+          <w:tcPr>
+            <w:tcW w:w="1583" w:type="dxa"/>
             <w:vAlign w:val="center"/>
           </w:tcPr>
           <w:p>
@@ -6197,7 +6527,7 @@
         </w:tc>
         <w:tc>
           <w:tcPr>
-            <w:tcW w:w="1150" w:type="dxa"/>
+            <w:tcW w:w="995" w:type="dxa"/>
             <w:vAlign w:val="center"/>
           </w:tcPr>
           <w:p>
@@ -6211,7 +6541,7 @@
         </w:tc>
         <w:tc>
           <w:tcPr>
-            <w:tcW w:w="1550" w:type="dxa"/>
+            <w:tcW w:w="1461" w:type="dxa"/>
             <w:vAlign w:val="center"/>
           </w:tcPr>
           <w:p>
@@ -6225,7 +6555,7 @@
         </w:tc>
         <w:tc>
           <w:tcPr>
-            <w:tcW w:w="1250" w:type="dxa"/>
+            <w:tcW w:w="1370" w:type="dxa"/>
             <w:vAlign w:val="center"/>
           </w:tcPr>
           <w:p>
@@ -6239,15 +6569,15 @@
         </w:tc>
         <w:tc>
           <w:tcPr>
-            <w:tcW w:w="2828" w:type="dxa"/>
-            <w:vAlign w:val="center"/>
-          </w:tcPr>
-          <w:p>
-            <w:pPr>
-              <w:spacing w:before="0" w:after="0"/>
-            </w:pPr>
-            <w:r>
-              <w:t xml:space="preserve">marcado por padrão</w:t>
+            <w:tcW w:w="1754" w:type="dxa"/>
+            <w:vAlign w:val="center"/>
+          </w:tcPr>
+          <w:p>
+            <w:pPr>
+              <w:spacing w:before="0" w:after="0"/>
+            </w:pPr>
+            <w:r>
+              <w:t xml:space="preserve">marcado por padrão; quando marcado, o cadastro corporativo envia o e-mail de pré-cadastro</w:t>
             </w:r>
           </w:p>
         </w:tc>
@@ -6255,7 +6585,7 @@
       <w:tr>
         <w:tc>
           <w:tcPr>
-            <w:tcW w:w="1500" w:type="dxa"/>
+            <w:tcW w:w="1187" w:type="dxa"/>
             <w:vAlign w:val="center"/>
           </w:tcPr>
           <w:p>
@@ -6269,7 +6599,21 @@
         </w:tc>
         <w:tc>
           <w:tcPr>
-            <w:tcW w:w="1350" w:type="dxa"/>
+            <w:tcW w:w="1278" w:type="dxa"/>
+            <w:vAlign w:val="center"/>
+          </w:tcPr>
+          <w:p>
+            <w:pPr>
+              <w:spacing w:before="0" w:after="0"/>
+            </w:pPr>
+            <w:r>
+              <w:t xml:space="preserve">Unidade Federativa</w:t>
+            </w:r>
+          </w:p>
+        </w:tc>
+        <w:tc>
+          <w:tcPr>
+            <w:tcW w:w="1583" w:type="dxa"/>
             <w:vAlign w:val="center"/>
           </w:tcPr>
           <w:p>
@@ -6283,7 +6627,7 @@
         </w:tc>
         <w:tc>
           <w:tcPr>
-            <w:tcW w:w="1150" w:type="dxa"/>
+            <w:tcW w:w="995" w:type="dxa"/>
             <w:vAlign w:val="center"/>
           </w:tcPr>
           <w:p>
@@ -6297,7 +6641,7 @@
         </w:tc>
         <w:tc>
           <w:tcPr>
-            <w:tcW w:w="1550" w:type="dxa"/>
+            <w:tcW w:w="1461" w:type="dxa"/>
             <w:vAlign w:val="center"/>
           </w:tcPr>
           <w:p>
@@ -6311,7 +6655,7 @@
         </w:tc>
         <w:tc>
           <w:tcPr>
-            <w:tcW w:w="1250" w:type="dxa"/>
+            <w:tcW w:w="1370" w:type="dxa"/>
             <w:vAlign w:val="center"/>
           </w:tcPr>
           <w:p>
@@ -6325,7 +6669,7 @@
         </w:tc>
         <w:tc>
           <w:tcPr>
-            <w:tcW w:w="2828" w:type="dxa"/>
+            <w:tcW w:w="1754" w:type="dxa"/>
             <w:vAlign w:val="center"/>
           </w:tcPr>
           <w:p>
@@ -6545,6 +6889,11 @@
       </w:r>
     </w:p>
     <w:p>
+      <w:r>
+        <w:t xml:space="preserve">No menu Avaliação › Alocação por Grupo, o administrador escolhe a premiação e a etapa e vê a matriz com uma linha por grupo, com informações como as inscrições do grupo, os avaliadores no pool e a situação do pool.</w:t>
+      </w:r>
+    </w:p>
+    <w:p>
       <w:pPr>
         <w:pStyle w:val="AxureHeadingBasic"/>
         <w:keepNext/>
@@ -6655,7 +7004,7 @@
               <w:spacing w:before="0" w:after="0"/>
             </w:pPr>
             <w:r>
-              <w:t xml:space="preserve">O grupo de avaliação é a combinação de categoria, modalidade, tipo de participante e submodalidade da oferta; a quantidade de inscrições exibida é a das inscrições ativas vinculadas ao grupo. → ver AVL-ALO-04 (Alocar Avaliador à Inscrição), regra 7. *(a submodalidade foi acrescentada ao grupo em 2026-09-01: antes esta feature a omitia, e a definição divergia da usada na alocação por inscrição)*</w:t>
+              <w:t xml:space="preserve">O grupo de avaliação é a combinação de categoria, modalidade, tipo de participante e submodalidade da oferta; a quantidade de inscrições exibida é a das inscrições ativas vinculadas ao grupo. → ver AVL-ALO-04 (Alocar Avaliador à Inscrição), regra 7. (a submodalidade foi acrescentada ao grupo em 2026-09-01: antes esta feature a omitia, e a definição divergia da usada na alocação por inscrição)</w:t>
             </w:r>
           </w:p>
         </w:tc>
@@ -7180,12 +7529,13 @@
         <w:tblLook w:val="04A0" w:firstRow="1" w:lastRow="0" w:firstColumn="1" w:lastColumn="0" w:noHBand="0" w:noVBand="1"/>
       </w:tblPr>
       <w:tblGrid>
-        <w:gridCol w:w="1500"/>
-        <w:gridCol w:w="1350"/>
-        <w:gridCol w:w="1150"/>
-        <w:gridCol w:w="1550"/>
-        <w:gridCol w:w="1250"/>
-        <w:gridCol w:w="2828"/>
+        <w:gridCol w:w="1210"/>
+        <w:gridCol w:w="1210"/>
+        <w:gridCol w:w="1758"/>
+        <w:gridCol w:w="1112"/>
+        <w:gridCol w:w="1273"/>
+        <w:gridCol w:w="1453"/>
+        <w:gridCol w:w="1612"/>
       </w:tblGrid>
       <w:tr>
         <w:trPr>
@@ -7193,7 +7543,7 @@
         </w:trPr>
         <w:tc>
           <w:tcPr>
-            <w:tcW w:w="1500" w:type="dxa"/>
+            <w:tcW w:w="1210" w:type="dxa"/>
             <w:shd w:val="clear" w:color="auto" w:fill="00B4C8"/>
             <w:vAlign w:val="center"/>
           </w:tcPr>
@@ -7217,7 +7567,7 @@
         </w:tc>
         <w:tc>
           <w:tcPr>
-            <w:tcW w:w="1350" w:type="dxa"/>
+            <w:tcW w:w="1210" w:type="dxa"/>
             <w:shd w:val="clear" w:color="auto" w:fill="00B4C8"/>
             <w:vAlign w:val="center"/>
           </w:tcPr>
@@ -7235,13 +7585,13 @@
                 <w:b/>
                 <w:bCs/>
               </w:rPr>
-              <w:t xml:space="preserve">Preenchimento</w:t>
-            </w:r>
-          </w:p>
-        </w:tc>
-        <w:tc>
-          <w:tcPr>
-            <w:tcW w:w="1150" w:type="dxa"/>
+              <w:t xml:space="preserve">Entidade</w:t>
+            </w:r>
+          </w:p>
+        </w:tc>
+        <w:tc>
+          <w:tcPr>
+            <w:tcW w:w="1758" w:type="dxa"/>
             <w:shd w:val="clear" w:color="auto" w:fill="00B4C8"/>
             <w:vAlign w:val="center"/>
           </w:tcPr>
@@ -7259,13 +7609,13 @@
                 <w:b/>
                 <w:bCs/>
               </w:rPr>
-              <w:t xml:space="preserve">Edição</w:t>
-            </w:r>
-          </w:p>
-        </w:tc>
-        <w:tc>
-          <w:tcPr>
-            <w:tcW w:w="1550" w:type="dxa"/>
+              <w:t xml:space="preserve">Preenchimento</w:t>
+            </w:r>
+          </w:p>
+        </w:tc>
+        <w:tc>
+          <w:tcPr>
+            <w:tcW w:w="1112" w:type="dxa"/>
             <w:shd w:val="clear" w:color="auto" w:fill="00B4C8"/>
             <w:vAlign w:val="center"/>
           </w:tcPr>
@@ -7283,13 +7633,13 @@
                 <w:b/>
                 <w:bCs/>
               </w:rPr>
-              <w:t xml:space="preserve">Tipo</w:t>
-            </w:r>
-          </w:p>
-        </w:tc>
-        <w:tc>
-          <w:tcPr>
-            <w:tcW w:w="1250" w:type="dxa"/>
+              <w:t xml:space="preserve">Edição</w:t>
+            </w:r>
+          </w:p>
+        </w:tc>
+        <w:tc>
+          <w:tcPr>
+            <w:tcW w:w="1273" w:type="dxa"/>
             <w:shd w:val="clear" w:color="auto" w:fill="00B4C8"/>
             <w:vAlign w:val="center"/>
           </w:tcPr>
@@ -7307,13 +7657,13 @@
                 <w:b/>
                 <w:bCs/>
               </w:rPr>
-              <w:t xml:space="preserve">Obrigatório</w:t>
-            </w:r>
-          </w:p>
-        </w:tc>
-        <w:tc>
-          <w:tcPr>
-            <w:tcW w:w="2828" w:type="dxa"/>
+              <w:t xml:space="preserve">Tipo</w:t>
+            </w:r>
+          </w:p>
+        </w:tc>
+        <w:tc>
+          <w:tcPr>
+            <w:tcW w:w="1453" w:type="dxa"/>
             <w:shd w:val="clear" w:color="auto" w:fill="00B4C8"/>
             <w:vAlign w:val="center"/>
           </w:tcPr>
@@ -7331,6 +7681,30 @@
                 <w:b/>
                 <w:bCs/>
               </w:rPr>
+              <w:t xml:space="preserve">Obrigatório</w:t>
+            </w:r>
+          </w:p>
+        </w:tc>
+        <w:tc>
+          <w:tcPr>
+            <w:tcW w:w="1612" w:type="dxa"/>
+            <w:shd w:val="clear" w:color="auto" w:fill="00B4C8"/>
+            <w:vAlign w:val="center"/>
+          </w:tcPr>
+          <w:p>
+            <w:pPr>
+              <w:spacing w:before="120" w:after="120"/>
+              <w:jc w:val="center"/>
+              <w:rPr>
+                <w:b/>
+                <w:bCs/>
+              </w:rPr>
+            </w:pPr>
+            <w:r>
+              <w:rPr>
+                <w:b/>
+                <w:bCs/>
+              </w:rPr>
               <w:t xml:space="preserve">Validação</w:t>
             </w:r>
           </w:p>
@@ -7339,7 +7713,7 @@
       <w:tr>
         <w:tc>
           <w:tcPr>
-            <w:tcW w:w="1500" w:type="dxa"/>
+            <w:tcW w:w="1210" w:type="dxa"/>
             <w:vAlign w:val="center"/>
           </w:tcPr>
           <w:p>
@@ -7353,7 +7727,21 @@
         </w:tc>
         <w:tc>
           <w:tcPr>
-            <w:tcW w:w="1350" w:type="dxa"/>
+            <w:tcW w:w="1210" w:type="dxa"/>
+            <w:vAlign w:val="center"/>
+          </w:tcPr>
+          <w:p>
+            <w:pPr>
+              <w:spacing w:before="0" w:after="0"/>
+            </w:pPr>
+            <w:r>
+              <w:t xml:space="preserve">Premiação</w:t>
+            </w:r>
+          </w:p>
+        </w:tc>
+        <w:tc>
+          <w:tcPr>
+            <w:tcW w:w="1758" w:type="dxa"/>
             <w:vAlign w:val="center"/>
           </w:tcPr>
           <w:p>
@@ -7367,7 +7755,7 @@
         </w:tc>
         <w:tc>
           <w:tcPr>
-            <w:tcW w:w="1150" w:type="dxa"/>
+            <w:tcW w:w="1112" w:type="dxa"/>
             <w:vAlign w:val="center"/>
           </w:tcPr>
           <w:p>
@@ -7381,7 +7769,7 @@
         </w:tc>
         <w:tc>
           <w:tcPr>
-            <w:tcW w:w="1550" w:type="dxa"/>
+            <w:tcW w:w="1273" w:type="dxa"/>
             <w:vAlign w:val="center"/>
           </w:tcPr>
           <w:p>
@@ -7395,7 +7783,7 @@
         </w:tc>
         <w:tc>
           <w:tcPr>
-            <w:tcW w:w="1250" w:type="dxa"/>
+            <w:tcW w:w="1453" w:type="dxa"/>
             <w:vAlign w:val="center"/>
           </w:tcPr>
           <w:p>
@@ -7409,7 +7797,7 @@
         </w:tc>
         <w:tc>
           <w:tcPr>
-            <w:tcW w:w="2828" w:type="dxa"/>
+            <w:tcW w:w="1612" w:type="dxa"/>
             <w:vAlign w:val="center"/>
           </w:tcPr>
           <w:p>
@@ -7425,7 +7813,7 @@
       <w:tr>
         <w:tc>
           <w:tcPr>
-            <w:tcW w:w="1500" w:type="dxa"/>
+            <w:tcW w:w="1210" w:type="dxa"/>
             <w:vAlign w:val="center"/>
           </w:tcPr>
           <w:p>
@@ -7439,7 +7827,21 @@
         </w:tc>
         <w:tc>
           <w:tcPr>
-            <w:tcW w:w="1350" w:type="dxa"/>
+            <w:tcW w:w="1210" w:type="dxa"/>
+            <w:vAlign w:val="center"/>
+          </w:tcPr>
+          <w:p>
+            <w:pPr>
+              <w:spacing w:before="0" w:after="0"/>
+            </w:pPr>
+            <w:r>
+              <w:t xml:space="preserve">Etapa</w:t>
+            </w:r>
+          </w:p>
+        </w:tc>
+        <w:tc>
+          <w:tcPr>
+            <w:tcW w:w="1758" w:type="dxa"/>
             <w:vAlign w:val="center"/>
           </w:tcPr>
           <w:p>
@@ -7453,7 +7855,7 @@
         </w:tc>
         <w:tc>
           <w:tcPr>
-            <w:tcW w:w="1150" w:type="dxa"/>
+            <w:tcW w:w="1112" w:type="dxa"/>
             <w:vAlign w:val="center"/>
           </w:tcPr>
           <w:p>
@@ -7467,7 +7869,7 @@
         </w:tc>
         <w:tc>
           <w:tcPr>
-            <w:tcW w:w="1550" w:type="dxa"/>
+            <w:tcW w:w="1273" w:type="dxa"/>
             <w:vAlign w:val="center"/>
           </w:tcPr>
           <w:p>
@@ -7481,7 +7883,7 @@
         </w:tc>
         <w:tc>
           <w:tcPr>
-            <w:tcW w:w="1250" w:type="dxa"/>
+            <w:tcW w:w="1453" w:type="dxa"/>
             <w:vAlign w:val="center"/>
           </w:tcPr>
           <w:p>
@@ -7495,7 +7897,7 @@
         </w:tc>
         <w:tc>
           <w:tcPr>
-            <w:tcW w:w="2828" w:type="dxa"/>
+            <w:tcW w:w="1612" w:type="dxa"/>
             <w:vAlign w:val="center"/>
           </w:tcPr>
           <w:p>
@@ -7759,6 +8161,11 @@
       </w:r>
     </w:p>
     <w:p>
+      <w:r>
+        <w:t xml:space="preserve">Nas telas Alocação por Grupo e Alocação por Inscrição, o administrador aciona a lupa ao lado do avaliador, escolhe a etapa no diálogo que se abre e, se quiser, aciona um dos totais para filtrar a lista pela situação.</w:t>
+      </w:r>
+    </w:p>
+    <w:p>
       <w:pPr>
         <w:pStyle w:val="AxureHeadingBasic"/>
         <w:keepNext/>
@@ -8415,12 +8822,13 @@
         <w:tblLook w:val="04A0" w:firstRow="1" w:lastRow="0" w:firstColumn="1" w:lastColumn="0" w:noHBand="0" w:noVBand="1"/>
       </w:tblPr>
       <w:tblGrid>
-        <w:gridCol w:w="1500"/>
-        <w:gridCol w:w="1350"/>
-        <w:gridCol w:w="1150"/>
-        <w:gridCol w:w="1550"/>
-        <w:gridCol w:w="1250"/>
-        <w:gridCol w:w="2828"/>
+        <w:gridCol w:w="1293"/>
+        <w:gridCol w:w="1242"/>
+        <w:gridCol w:w="1766"/>
+        <w:gridCol w:w="1117"/>
+        <w:gridCol w:w="1078"/>
+        <w:gridCol w:w="1457"/>
+        <w:gridCol w:w="1675"/>
       </w:tblGrid>
       <w:tr>
         <w:trPr>
@@ -8428,7 +8836,7 @@
         </w:trPr>
         <w:tc>
           <w:tcPr>
-            <w:tcW w:w="1500" w:type="dxa"/>
+            <w:tcW w:w="1293" w:type="dxa"/>
             <w:shd w:val="clear" w:color="auto" w:fill="00B4C8"/>
             <w:vAlign w:val="center"/>
           </w:tcPr>
@@ -8452,7 +8860,7 @@
         </w:tc>
         <w:tc>
           <w:tcPr>
-            <w:tcW w:w="1350" w:type="dxa"/>
+            <w:tcW w:w="1242" w:type="dxa"/>
             <w:shd w:val="clear" w:color="auto" w:fill="00B4C8"/>
             <w:vAlign w:val="center"/>
           </w:tcPr>
@@ -8470,13 +8878,13 @@
                 <w:b/>
                 <w:bCs/>
               </w:rPr>
-              <w:t xml:space="preserve">Preenchimento</w:t>
-            </w:r>
-          </w:p>
-        </w:tc>
-        <w:tc>
-          <w:tcPr>
-            <w:tcW w:w="1150" w:type="dxa"/>
+              <w:t xml:space="preserve">Entidade</w:t>
+            </w:r>
+          </w:p>
+        </w:tc>
+        <w:tc>
+          <w:tcPr>
+            <w:tcW w:w="1766" w:type="dxa"/>
             <w:shd w:val="clear" w:color="auto" w:fill="00B4C8"/>
             <w:vAlign w:val="center"/>
           </w:tcPr>
@@ -8494,13 +8902,13 @@
                 <w:b/>
                 <w:bCs/>
               </w:rPr>
-              <w:t xml:space="preserve">Edição</w:t>
-            </w:r>
-          </w:p>
-        </w:tc>
-        <w:tc>
-          <w:tcPr>
-            <w:tcW w:w="1550" w:type="dxa"/>
+              <w:t xml:space="preserve">Preenchimento</w:t>
+            </w:r>
+          </w:p>
+        </w:tc>
+        <w:tc>
+          <w:tcPr>
+            <w:tcW w:w="1117" w:type="dxa"/>
             <w:shd w:val="clear" w:color="auto" w:fill="00B4C8"/>
             <w:vAlign w:val="center"/>
           </w:tcPr>
@@ -8518,13 +8926,13 @@
                 <w:b/>
                 <w:bCs/>
               </w:rPr>
-              <w:t xml:space="preserve">Tipo</w:t>
-            </w:r>
-          </w:p>
-        </w:tc>
-        <w:tc>
-          <w:tcPr>
-            <w:tcW w:w="1250" w:type="dxa"/>
+              <w:t xml:space="preserve">Edição</w:t>
+            </w:r>
+          </w:p>
+        </w:tc>
+        <w:tc>
+          <w:tcPr>
+            <w:tcW w:w="1078" w:type="dxa"/>
             <w:shd w:val="clear" w:color="auto" w:fill="00B4C8"/>
             <w:vAlign w:val="center"/>
           </w:tcPr>
@@ -8542,13 +8950,13 @@
                 <w:b/>
                 <w:bCs/>
               </w:rPr>
-              <w:t xml:space="preserve">Obrigatório</w:t>
-            </w:r>
-          </w:p>
-        </w:tc>
-        <w:tc>
-          <w:tcPr>
-            <w:tcW w:w="2828" w:type="dxa"/>
+              <w:t xml:space="preserve">Tipo</w:t>
+            </w:r>
+          </w:p>
+        </w:tc>
+        <w:tc>
+          <w:tcPr>
+            <w:tcW w:w="1457" w:type="dxa"/>
             <w:shd w:val="clear" w:color="auto" w:fill="00B4C8"/>
             <w:vAlign w:val="center"/>
           </w:tcPr>
@@ -8566,6 +8974,30 @@
                 <w:b/>
                 <w:bCs/>
               </w:rPr>
+              <w:t xml:space="preserve">Obrigatório</w:t>
+            </w:r>
+          </w:p>
+        </w:tc>
+        <w:tc>
+          <w:tcPr>
+            <w:tcW w:w="1675" w:type="dxa"/>
+            <w:shd w:val="clear" w:color="auto" w:fill="00B4C8"/>
+            <w:vAlign w:val="center"/>
+          </w:tcPr>
+          <w:p>
+            <w:pPr>
+              <w:spacing w:before="120" w:after="120"/>
+              <w:jc w:val="center"/>
+              <w:rPr>
+                <w:b/>
+                <w:bCs/>
+              </w:rPr>
+            </w:pPr>
+            <w:r>
+              <w:rPr>
+                <w:b/>
+                <w:bCs/>
+              </w:rPr>
               <w:t xml:space="preserve">Validação</w:t>
             </w:r>
           </w:p>
@@ -8574,7 +9006,7 @@
       <w:tr>
         <w:tc>
           <w:tcPr>
-            <w:tcW w:w="1500" w:type="dxa"/>
+            <w:tcW w:w="1293" w:type="dxa"/>
             <w:vAlign w:val="center"/>
           </w:tcPr>
           <w:p>
@@ -8588,21 +9020,35 @@
         </w:tc>
         <w:tc>
           <w:tcPr>
-            <w:tcW w:w="1350" w:type="dxa"/>
-            <w:vAlign w:val="center"/>
-          </w:tcPr>
-          <w:p>
-            <w:pPr>
-              <w:spacing w:before="0" w:after="0"/>
-            </w:pPr>
-            <w:r>
-              <w:t xml:space="preserve">seleção → Etapa da premiação</w:t>
-            </w:r>
-          </w:p>
-        </w:tc>
-        <w:tc>
-          <w:tcPr>
-            <w:tcW w:w="1150" w:type="dxa"/>
+            <w:tcW w:w="1242" w:type="dxa"/>
+            <w:vAlign w:val="center"/>
+          </w:tcPr>
+          <w:p>
+            <w:pPr>
+              <w:spacing w:before="0" w:after="0"/>
+            </w:pPr>
+            <w:r>
+              <w:t xml:space="preserve">Etapa</w:t>
+            </w:r>
+          </w:p>
+        </w:tc>
+        <w:tc>
+          <w:tcPr>
+            <w:tcW w:w="1766" w:type="dxa"/>
+            <w:vAlign w:val="center"/>
+          </w:tcPr>
+          <w:p>
+            <w:pPr>
+              <w:spacing w:before="0" w:after="0"/>
+            </w:pPr>
+            <w:r>
+              <w:t xml:space="preserve">entrada do usuário</w:t>
+            </w:r>
+          </w:p>
+        </w:tc>
+        <w:tc>
+          <w:tcPr>
+            <w:tcW w:w="1117" w:type="dxa"/>
             <w:vAlign w:val="center"/>
           </w:tcPr>
           <w:p>
@@ -8616,21 +9062,21 @@
         </w:tc>
         <w:tc>
           <w:tcPr>
-            <w:tcW w:w="1550" w:type="dxa"/>
-            <w:vAlign w:val="center"/>
-          </w:tcPr>
-          <w:p>
-            <w:pPr>
-              <w:spacing w:before="0" w:after="0"/>
-            </w:pPr>
-            <w:r>
-              <w:t xml:space="preserve">lista de opções</w:t>
-            </w:r>
-          </w:p>
-        </w:tc>
-        <w:tc>
-          <w:tcPr>
-            <w:tcW w:w="1250" w:type="dxa"/>
+            <w:tcW w:w="1078" w:type="dxa"/>
+            <w:vAlign w:val="center"/>
+          </w:tcPr>
+          <w:p>
+            <w:pPr>
+              <w:spacing w:before="0" w:after="0"/>
+            </w:pPr>
+            <w:r>
+              <w:t xml:space="preserve">seleção → Etapa</w:t>
+            </w:r>
+          </w:p>
+        </w:tc>
+        <w:tc>
+          <w:tcPr>
+            <w:tcW w:w="1457" w:type="dxa"/>
             <w:vAlign w:val="center"/>
           </w:tcPr>
           <w:p>
@@ -8644,7 +9090,7 @@
         </w:tc>
         <w:tc>
           <w:tcPr>
-            <w:tcW w:w="2828" w:type="dxa"/>
+            <w:tcW w:w="1675" w:type="dxa"/>
             <w:vAlign w:val="center"/>
           </w:tcPr>
           <w:p>
@@ -8660,7 +9106,7 @@
       <w:tr>
         <w:tc>
           <w:tcPr>
-            <w:tcW w:w="1500" w:type="dxa"/>
+            <w:tcW w:w="1293" w:type="dxa"/>
             <w:vAlign w:val="center"/>
           </w:tcPr>
           <w:p>
@@ -8674,7 +9120,21 @@
         </w:tc>
         <w:tc>
           <w:tcPr>
-            <w:tcW w:w="1350" w:type="dxa"/>
+            <w:tcW w:w="1242" w:type="dxa"/>
+            <w:vAlign w:val="center"/>
+          </w:tcPr>
+          <w:p>
+            <w:pPr>
+              <w:spacing w:before="0" w:after="0"/>
+            </w:pPr>
+            <w:r>
+              <w:t xml:space="preserve">dado de código</w:t>
+            </w:r>
+          </w:p>
+        </w:tc>
+        <w:tc>
+          <w:tcPr>
+            <w:tcW w:w="1766" w:type="dxa"/>
             <w:vAlign w:val="center"/>
           </w:tcPr>
           <w:p>
@@ -8688,7 +9148,7 @@
         </w:tc>
         <w:tc>
           <w:tcPr>
-            <w:tcW w:w="1150" w:type="dxa"/>
+            <w:tcW w:w="1117" w:type="dxa"/>
             <w:vAlign w:val="center"/>
           </w:tcPr>
           <w:p>
@@ -8702,7 +9162,7 @@
         </w:tc>
         <w:tc>
           <w:tcPr>
-            <w:tcW w:w="1550" w:type="dxa"/>
+            <w:tcW w:w="1078" w:type="dxa"/>
             <w:vAlign w:val="center"/>
           </w:tcPr>
           <w:p>
@@ -8716,7 +9176,7 @@
         </w:tc>
         <w:tc>
           <w:tcPr>
-            <w:tcW w:w="1250" w:type="dxa"/>
+            <w:tcW w:w="1457" w:type="dxa"/>
             <w:vAlign w:val="center"/>
           </w:tcPr>
           <w:p>
@@ -8730,7 +9190,7 @@
         </w:tc>
         <w:tc>
           <w:tcPr>
-            <w:tcW w:w="2828" w:type="dxa"/>
+            <w:tcW w:w="1675" w:type="dxa"/>
             <w:vAlign w:val="center"/>
           </w:tcPr>
           <w:p>
@@ -9126,6 +9586,11 @@
       </w:r>
     </w:p>
     <w:p>
+      <w:r>
+        <w:t xml:space="preserve">O aviso aparece por conta própria nas telas administrativas da premiação, com uma linha por etapa pendente; ao selecionar a linha, o administrador é levado à Alocação por Inscrição com a premiação e a etapa já aplicadas.</w:t>
+      </w:r>
+    </w:p>
+    <w:p>
       <w:pPr>
         <w:pStyle w:val="AxureHeadingBasic"/>
         <w:keepNext/>
@@ -9832,12 +10297,13 @@
         <w:tblLook w:val="04A0" w:firstRow="1" w:lastRow="0" w:firstColumn="1" w:lastColumn="0" w:noHBand="0" w:noVBand="1"/>
       </w:tblPr>
       <w:tblGrid>
-        <w:gridCol w:w="1500"/>
-        <w:gridCol w:w="1350"/>
-        <w:gridCol w:w="1150"/>
-        <w:gridCol w:w="1550"/>
-        <w:gridCol w:w="1250"/>
-        <w:gridCol w:w="2828"/>
+        <w:gridCol w:w="1408"/>
+        <w:gridCol w:w="1137"/>
+        <w:gridCol w:w="1707"/>
+        <w:gridCol w:w="1024"/>
+        <w:gridCol w:w="1485"/>
+        <w:gridCol w:w="1429"/>
+        <w:gridCol w:w="1438"/>
       </w:tblGrid>
       <w:tr>
         <w:trPr>
@@ -9845,7 +10311,7 @@
         </w:trPr>
         <w:tc>
           <w:tcPr>
-            <w:tcW w:w="1500" w:type="dxa"/>
+            <w:tcW w:w="1408" w:type="dxa"/>
             <w:shd w:val="clear" w:color="auto" w:fill="00B4C8"/>
             <w:vAlign w:val="center"/>
           </w:tcPr>
@@ -9869,7 +10335,7 @@
         </w:tc>
         <w:tc>
           <w:tcPr>
-            <w:tcW w:w="1350" w:type="dxa"/>
+            <w:tcW w:w="1137" w:type="dxa"/>
             <w:shd w:val="clear" w:color="auto" w:fill="00B4C8"/>
             <w:vAlign w:val="center"/>
           </w:tcPr>
@@ -9887,13 +10353,13 @@
                 <w:b/>
                 <w:bCs/>
               </w:rPr>
-              <w:t xml:space="preserve">Preenchimento</w:t>
-            </w:r>
-          </w:p>
-        </w:tc>
-        <w:tc>
-          <w:tcPr>
-            <w:tcW w:w="1150" w:type="dxa"/>
+              <w:t xml:space="preserve">Entidade</w:t>
+            </w:r>
+          </w:p>
+        </w:tc>
+        <w:tc>
+          <w:tcPr>
+            <w:tcW w:w="1707" w:type="dxa"/>
             <w:shd w:val="clear" w:color="auto" w:fill="00B4C8"/>
             <w:vAlign w:val="center"/>
           </w:tcPr>
@@ -9911,13 +10377,13 @@
                 <w:b/>
                 <w:bCs/>
               </w:rPr>
-              <w:t xml:space="preserve">Edição</w:t>
-            </w:r>
-          </w:p>
-        </w:tc>
-        <w:tc>
-          <w:tcPr>
-            <w:tcW w:w="1550" w:type="dxa"/>
+              <w:t xml:space="preserve">Preenchimento</w:t>
+            </w:r>
+          </w:p>
+        </w:tc>
+        <w:tc>
+          <w:tcPr>
+            <w:tcW w:w="1024" w:type="dxa"/>
             <w:shd w:val="clear" w:color="auto" w:fill="00B4C8"/>
             <w:vAlign w:val="center"/>
           </w:tcPr>
@@ -9935,13 +10401,13 @@
                 <w:b/>
                 <w:bCs/>
               </w:rPr>
-              <w:t xml:space="preserve">Tipo</w:t>
-            </w:r>
-          </w:p>
-        </w:tc>
-        <w:tc>
-          <w:tcPr>
-            <w:tcW w:w="1250" w:type="dxa"/>
+              <w:t xml:space="preserve">Edição</w:t>
+            </w:r>
+          </w:p>
+        </w:tc>
+        <w:tc>
+          <w:tcPr>
+            <w:tcW w:w="1485" w:type="dxa"/>
             <w:shd w:val="clear" w:color="auto" w:fill="00B4C8"/>
             <w:vAlign w:val="center"/>
           </w:tcPr>
@@ -9959,13 +10425,13 @@
                 <w:b/>
                 <w:bCs/>
               </w:rPr>
-              <w:t xml:space="preserve">Obrigatório</w:t>
-            </w:r>
-          </w:p>
-        </w:tc>
-        <w:tc>
-          <w:tcPr>
-            <w:tcW w:w="2828" w:type="dxa"/>
+              <w:t xml:space="preserve">Tipo</w:t>
+            </w:r>
+          </w:p>
+        </w:tc>
+        <w:tc>
+          <w:tcPr>
+            <w:tcW w:w="1429" w:type="dxa"/>
             <w:shd w:val="clear" w:color="auto" w:fill="00B4C8"/>
             <w:vAlign w:val="center"/>
           </w:tcPr>
@@ -9983,6 +10449,30 @@
                 <w:b/>
                 <w:bCs/>
               </w:rPr>
+              <w:t xml:space="preserve">Obrigatório</w:t>
+            </w:r>
+          </w:p>
+        </w:tc>
+        <w:tc>
+          <w:tcPr>
+            <w:tcW w:w="1438" w:type="dxa"/>
+            <w:shd w:val="clear" w:color="auto" w:fill="00B4C8"/>
+            <w:vAlign w:val="center"/>
+          </w:tcPr>
+          <w:p>
+            <w:pPr>
+              <w:spacing w:before="120" w:after="120"/>
+              <w:jc w:val="center"/>
+              <w:rPr>
+                <w:b/>
+                <w:bCs/>
+              </w:rPr>
+            </w:pPr>
+            <w:r>
+              <w:rPr>
+                <w:b/>
+                <w:bCs/>
+              </w:rPr>
               <w:t xml:space="preserve">Validação</w:t>
             </w:r>
           </w:p>
@@ -9991,7 +10481,7 @@
       <w:tr>
         <w:tc>
           <w:tcPr>
-            <w:tcW w:w="1500" w:type="dxa"/>
+            <w:tcW w:w="1408" w:type="dxa"/>
             <w:vAlign w:val="center"/>
           </w:tcPr>
           <w:p>
@@ -10005,21 +10495,35 @@
         </w:tc>
         <w:tc>
           <w:tcPr>
-            <w:tcW w:w="1350" w:type="dxa"/>
-            <w:vAlign w:val="center"/>
-          </w:tcPr>
-          <w:p>
-            <w:pPr>
-              <w:spacing w:before="0" w:after="0"/>
-            </w:pPr>
-            <w:r>
-              <w:t xml:space="preserve">seleção → linha da lista de pendências</w:t>
-            </w:r>
-          </w:p>
-        </w:tc>
-        <w:tc>
-          <w:tcPr>
-            <w:tcW w:w="1150" w:type="dxa"/>
+            <w:tcW w:w="1137" w:type="dxa"/>
+            <w:vAlign w:val="center"/>
+          </w:tcPr>
+          <w:p>
+            <w:pPr>
+              <w:spacing w:before="0" w:after="0"/>
+            </w:pPr>
+            <w:r>
+              <w:t xml:space="preserve">Etapa</w:t>
+            </w:r>
+          </w:p>
+        </w:tc>
+        <w:tc>
+          <w:tcPr>
+            <w:tcW w:w="1707" w:type="dxa"/>
+            <w:vAlign w:val="center"/>
+          </w:tcPr>
+          <w:p>
+            <w:pPr>
+              <w:spacing w:before="0" w:after="0"/>
+            </w:pPr>
+            <w:r>
+              <w:t xml:space="preserve">entrada do usuário</w:t>
+            </w:r>
+          </w:p>
+        </w:tc>
+        <w:tc>
+          <w:tcPr>
+            <w:tcW w:w="1024" w:type="dxa"/>
             <w:vAlign w:val="center"/>
           </w:tcPr>
           <w:p>
@@ -10033,21 +10537,21 @@
         </w:tc>
         <w:tc>
           <w:tcPr>
-            <w:tcW w:w="1550" w:type="dxa"/>
-            <w:vAlign w:val="center"/>
-          </w:tcPr>
-          <w:p>
-            <w:pPr>
-              <w:spacing w:before="0" w:after="0"/>
-            </w:pPr>
-            <w:r>
-              <w:t xml:space="preserve">lista</w:t>
-            </w:r>
-          </w:p>
-        </w:tc>
-        <w:tc>
-          <w:tcPr>
-            <w:tcW w:w="1250" w:type="dxa"/>
+            <w:tcW w:w="1485" w:type="dxa"/>
+            <w:vAlign w:val="center"/>
+          </w:tcPr>
+          <w:p>
+            <w:pPr>
+              <w:spacing w:before="0" w:after="0"/>
+            </w:pPr>
+            <w:r>
+              <w:t xml:space="preserve">seleção → Etapa (linha da lista de pendências)</w:t>
+            </w:r>
+          </w:p>
+        </w:tc>
+        <w:tc>
+          <w:tcPr>
+            <w:tcW w:w="1429" w:type="dxa"/>
             <w:vAlign w:val="center"/>
           </w:tcPr>
           <w:p>
@@ -10061,7 +10565,7 @@
         </w:tc>
         <w:tc>
           <w:tcPr>
-            <w:tcW w:w="2828" w:type="dxa"/>
+            <w:tcW w:w="1438" w:type="dxa"/>
             <w:vAlign w:val="center"/>
           </w:tcPr>
           <w:p>
@@ -10281,6 +10785,11 @@
       </w:r>
     </w:p>
     <w:p>
+      <w:r>
+        <w:t xml:space="preserve">Na tela Alocação por Grupo, com a etapa selecionada, o administrador aciona "Relatório de alocação (XLSX)" e recebe a planilha para download.</w:t>
+      </w:r>
+    </w:p>
+    <w:p>
       <w:pPr>
         <w:pStyle w:val="AxureHeadingBasic"/>
         <w:keepNext/>
@@ -10890,12 +11399,13 @@
         <w:tblLook w:val="04A0" w:firstRow="1" w:lastRow="0" w:firstColumn="1" w:lastColumn="0" w:noHBand="0" w:noVBand="1"/>
       </w:tblPr>
       <w:tblGrid>
-        <w:gridCol w:w="1500"/>
-        <w:gridCol w:w="1350"/>
-        <w:gridCol w:w="1150"/>
-        <w:gridCol w:w="1550"/>
-        <w:gridCol w:w="1250"/>
-        <w:gridCol w:w="2828"/>
+        <w:gridCol w:w="1202"/>
+        <w:gridCol w:w="1202"/>
+        <w:gridCol w:w="1830"/>
+        <w:gridCol w:w="1137"/>
+        <w:gridCol w:w="1137"/>
+        <w:gridCol w:w="1487"/>
+        <w:gridCol w:w="1633"/>
       </w:tblGrid>
       <w:tr>
         <w:trPr>
@@ -10903,7 +11413,7 @@
         </w:trPr>
         <w:tc>
           <w:tcPr>
-            <w:tcW w:w="1500" w:type="dxa"/>
+            <w:tcW w:w="1202" w:type="dxa"/>
             <w:shd w:val="clear" w:color="auto" w:fill="00B4C8"/>
             <w:vAlign w:val="center"/>
           </w:tcPr>
@@ -10927,7 +11437,7 @@
         </w:tc>
         <w:tc>
           <w:tcPr>
-            <w:tcW w:w="1350" w:type="dxa"/>
+            <w:tcW w:w="1202" w:type="dxa"/>
             <w:shd w:val="clear" w:color="auto" w:fill="00B4C8"/>
             <w:vAlign w:val="center"/>
           </w:tcPr>
@@ -10945,13 +11455,13 @@
                 <w:b/>
                 <w:bCs/>
               </w:rPr>
-              <w:t xml:space="preserve">Preenchimento</w:t>
-            </w:r>
-          </w:p>
-        </w:tc>
-        <w:tc>
-          <w:tcPr>
-            <w:tcW w:w="1150" w:type="dxa"/>
+              <w:t xml:space="preserve">Entidade</w:t>
+            </w:r>
+          </w:p>
+        </w:tc>
+        <w:tc>
+          <w:tcPr>
+            <w:tcW w:w="1830" w:type="dxa"/>
             <w:shd w:val="clear" w:color="auto" w:fill="00B4C8"/>
             <w:vAlign w:val="center"/>
           </w:tcPr>
@@ -10969,13 +11479,13 @@
                 <w:b/>
                 <w:bCs/>
               </w:rPr>
-              <w:t xml:space="preserve">Edição</w:t>
-            </w:r>
-          </w:p>
-        </w:tc>
-        <w:tc>
-          <w:tcPr>
-            <w:tcW w:w="1550" w:type="dxa"/>
+              <w:t xml:space="preserve">Preenchimento</w:t>
+            </w:r>
+          </w:p>
+        </w:tc>
+        <w:tc>
+          <w:tcPr>
+            <w:tcW w:w="1137" w:type="dxa"/>
             <w:shd w:val="clear" w:color="auto" w:fill="00B4C8"/>
             <w:vAlign w:val="center"/>
           </w:tcPr>
@@ -10993,13 +11503,13 @@
                 <w:b/>
                 <w:bCs/>
               </w:rPr>
-              <w:t xml:space="preserve">Tipo</w:t>
-            </w:r>
-          </w:p>
-        </w:tc>
-        <w:tc>
-          <w:tcPr>
-            <w:tcW w:w="1250" w:type="dxa"/>
+              <w:t xml:space="preserve">Edição</w:t>
+            </w:r>
+          </w:p>
+        </w:tc>
+        <w:tc>
+          <w:tcPr>
+            <w:tcW w:w="1137" w:type="dxa"/>
             <w:shd w:val="clear" w:color="auto" w:fill="00B4C8"/>
             <w:vAlign w:val="center"/>
           </w:tcPr>
@@ -11017,13 +11527,13 @@
                 <w:b/>
                 <w:bCs/>
               </w:rPr>
-              <w:t xml:space="preserve">Obrigatório</w:t>
-            </w:r>
-          </w:p>
-        </w:tc>
-        <w:tc>
-          <w:tcPr>
-            <w:tcW w:w="2828" w:type="dxa"/>
+              <w:t xml:space="preserve">Tipo</w:t>
+            </w:r>
+          </w:p>
+        </w:tc>
+        <w:tc>
+          <w:tcPr>
+            <w:tcW w:w="1487" w:type="dxa"/>
             <w:shd w:val="clear" w:color="auto" w:fill="00B4C8"/>
             <w:vAlign w:val="center"/>
           </w:tcPr>
@@ -11041,6 +11551,30 @@
                 <w:b/>
                 <w:bCs/>
               </w:rPr>
+              <w:t xml:space="preserve">Obrigatório</w:t>
+            </w:r>
+          </w:p>
+        </w:tc>
+        <w:tc>
+          <w:tcPr>
+            <w:tcW w:w="1633" w:type="dxa"/>
+            <w:shd w:val="clear" w:color="auto" w:fill="00B4C8"/>
+            <w:vAlign w:val="center"/>
+          </w:tcPr>
+          <w:p>
+            <w:pPr>
+              <w:spacing w:before="120" w:after="120"/>
+              <w:jc w:val="center"/>
+              <w:rPr>
+                <w:b/>
+                <w:bCs/>
+              </w:rPr>
+            </w:pPr>
+            <w:r>
+              <w:rPr>
+                <w:b/>
+                <w:bCs/>
+              </w:rPr>
               <w:t xml:space="preserve">Validação</w:t>
             </w:r>
           </w:p>
@@ -11049,7 +11583,7 @@
       <w:tr>
         <w:tc>
           <w:tcPr>
-            <w:tcW w:w="1500" w:type="dxa"/>
+            <w:tcW w:w="1202" w:type="dxa"/>
             <w:vAlign w:val="center"/>
           </w:tcPr>
           <w:p>
@@ -11063,21 +11597,35 @@
         </w:tc>
         <w:tc>
           <w:tcPr>
-            <w:tcW w:w="1350" w:type="dxa"/>
-            <w:vAlign w:val="center"/>
-          </w:tcPr>
-          <w:p>
-            <w:pPr>
-              <w:spacing w:before="0" w:after="0"/>
-            </w:pPr>
-            <w:r>
-              <w:t xml:space="preserve">seleção → Etapa da premiação</w:t>
-            </w:r>
-          </w:p>
-        </w:tc>
-        <w:tc>
-          <w:tcPr>
-            <w:tcW w:w="1150" w:type="dxa"/>
+            <w:tcW w:w="1202" w:type="dxa"/>
+            <w:vAlign w:val="center"/>
+          </w:tcPr>
+          <w:p>
+            <w:pPr>
+              <w:spacing w:before="0" w:after="0"/>
+            </w:pPr>
+            <w:r>
+              <w:t xml:space="preserve">Etapa</w:t>
+            </w:r>
+          </w:p>
+        </w:tc>
+        <w:tc>
+          <w:tcPr>
+            <w:tcW w:w="1830" w:type="dxa"/>
+            <w:vAlign w:val="center"/>
+          </w:tcPr>
+          <w:p>
+            <w:pPr>
+              <w:spacing w:before="0" w:after="0"/>
+            </w:pPr>
+            <w:r>
+              <w:t xml:space="preserve">entrada do usuário</w:t>
+            </w:r>
+          </w:p>
+        </w:tc>
+        <w:tc>
+          <w:tcPr>
+            <w:tcW w:w="1137" w:type="dxa"/>
             <w:vAlign w:val="center"/>
           </w:tcPr>
           <w:p>
@@ -11091,21 +11639,21 @@
         </w:tc>
         <w:tc>
           <w:tcPr>
-            <w:tcW w:w="1550" w:type="dxa"/>
-            <w:vAlign w:val="center"/>
-          </w:tcPr>
-          <w:p>
-            <w:pPr>
-              <w:spacing w:before="0" w:after="0"/>
-            </w:pPr>
-            <w:r>
-              <w:t xml:space="preserve">lista de opções</w:t>
-            </w:r>
-          </w:p>
-        </w:tc>
-        <w:tc>
-          <w:tcPr>
-            <w:tcW w:w="1250" w:type="dxa"/>
+            <w:tcW w:w="1137" w:type="dxa"/>
+            <w:vAlign w:val="center"/>
+          </w:tcPr>
+          <w:p>
+            <w:pPr>
+              <w:spacing w:before="0" w:after="0"/>
+            </w:pPr>
+            <w:r>
+              <w:t xml:space="preserve">seleção → Etapa</w:t>
+            </w:r>
+          </w:p>
+        </w:tc>
+        <w:tc>
+          <w:tcPr>
+            <w:tcW w:w="1487" w:type="dxa"/>
             <w:vAlign w:val="center"/>
           </w:tcPr>
           <w:p>
@@ -11119,15 +11667,15 @@
         </w:tc>
         <w:tc>
           <w:tcPr>
-            <w:tcW w:w="2828" w:type="dxa"/>
-            <w:vAlign w:val="center"/>
-          </w:tcPr>
-          <w:p>
-            <w:pPr>
-              <w:spacing w:before="0" w:after="0"/>
-            </w:pPr>
-            <w:r>
-              <w:t xml:space="preserve">a etapa em consulta na alocação por grupo</w:t>
+            <w:tcW w:w="1633" w:type="dxa"/>
+            <w:vAlign w:val="center"/>
+          </w:tcPr>
+          <w:p>
+            <w:pPr>
+              <w:spacing w:before="0" w:after="0"/>
+            </w:pPr>
+            <w:r>
+              <w:t xml:space="preserve">a etapa da premiação em consulta na alocação por grupo</w:t>
             </w:r>
           </w:p>
         </w:tc>

</xml_diff>